<commit_message>
Report: tuning without the test set, final model chosen with cross-validation, notebook self-contained
</commit_message>
<xml_diff>
--- a/reports/Project_Report_Group28.docx
+++ b/reports/Project_Report_Group28.docx
@@ -52,26 +52,12 @@
     </w:p>
     <w:p>
       <w:r>
-        <w:t>Football is</w:t>
-      </w:r>
-      <w:r>
-        <w:t xml:space="preserve"> considered</w:t>
-      </w:r>
-      <w:r>
-        <w:t xml:space="preserve"> the most popular sport in South America, and the World Cup qualifiers of CONMEBOL, the South American football confederation, are often called the hardest qualifying competition in the world. The ten national teams play each other twice, at home and away, which gives 90 matches over two years. The qualifiers are known for a very strong home advantage. Part of it comes from long trips and loud crowds, but part of it is geography: Bolivia plays its home matches in La Paz and El Alto, 3,600 to 4,100 metres above sea level, and Ecuador plays in Quito at 2,850 metres.</w:t>
-      </w:r>
-    </w:p>
-    <w:p>
-      <w:r>
-        <w:t xml:space="preserve">Predicting the score of a match is difficult, because goals are rare and one lucky goal can change the result. Still, what is known before kick-off, such as the strength of the two teams, their recent form and where the match is played, clearly says something about the expected score. In this project we predict the number of goals scored by the home team and by the away team, which makes it a regression problem. As the project guidelines require, we use two algorithms: linear regression, which we implemented ourselves with NumPy, and a random forest from scikit-learn (Pedregosa et al., 2011). All the code is in the notebook and the </w:t>
-      </w:r>
-      <w:proofErr w:type="spellStart"/>
-      <w:r>
-        <w:t>src</w:t>
-      </w:r>
-      <w:proofErr w:type="spellEnd"/>
-      <w:r>
-        <w:t xml:space="preserve"> folder of our repository, so this report focuses on how the methods work and on what the results mean.</w:t>
+        <w:t xml:space="preserve">Football is considered the most popular sport in South America, and the World Cup qualifiers of CONMEBOL, the South American football confederation, are often called the hardest qualifying competition in the world. The ten national teams play each other twice, at home and away, which gives 90 matches over two years. The qualifiers are known for a very strong home advantage. Part of it comes from long trips and loud crowds, but part of it is geography: Bolivia plays its home matches in La Paz and El Alto, 3,600 to 4,100 metres above sea level, and Ecuador plays in Quito at 2,850 metres.</w:t>
+      </w:r>
+    </w:p>
+    <w:p>
+      <w:r>
+        <w:t xml:space="preserve">Predicting the score of a match is difficult, because goals are rare and one lucky goal can change the result. Still, what is known before kick-off, such as the strength of the two teams, their recent form and where the match is played, clearly says something about the expected score. In this project we predict the number of goals scored by the home team and by the away team, which makes it a regression problem. As the project guidelines require, we use two algorithms: linear regression, which we implemented ourselves with NumPy, and a random forest from scikit-learn (Pedregosa et al., 2011). All the code is in the notebook we hand in with this report, so this report focuses on how the methods work and on what the results mean.</w:t>
       </w:r>
     </w:p>
     <w:p>
@@ -133,30 +119,12 @@
     </w:p>
     <w:p>
       <w:r>
-        <w:t xml:space="preserve">We use the dataset </w:t>
-      </w:r>
-      <w:proofErr w:type="gramStart"/>
-      <w:r>
-        <w:t>International</w:t>
-      </w:r>
-      <w:proofErr w:type="gramEnd"/>
-      <w:r>
-        <w:t xml:space="preserve"> football results from 1872 by Mart Jürisoo (2026), published on Kaggle. The author keeps it up to date on GitHub, where we downloaded our copy on 13 October 2026. The main file, results.csv, has 49,945 men’s international matches from 30 November 1872 to 6 October 2026, with nine columns: the date, the home team, the away team, the home score, the away score, the tournament, the city, the country and whether the venue was neutral. The two scores are our targets; they are whole numbers from 0 and up. The file has no missing values and no </w:t>
-      </w:r>
-      <w:r>
-        <w:lastRenderedPageBreak/>
-        <w:t>duplicated rows. A second file lists 36 former team names (for example Dahomey for Benin), and the files with goal scorers and penalty shoot-outs were not needed.</w:t>
-      </w:r>
-    </w:p>
-    <w:p>
-      <w:r>
-        <w:t xml:space="preserve">The dataset only contains results, so all the features had to be built by us from the earlier matches of each team (section 4.2). The scores are small and </w:t>
-      </w:r>
-      <w:r>
-        <w:t>skewed</w:t>
-      </w:r>
-      <w:r>
-        <w:t>. In our training data (1994 to August 2023) the home team scored 0, 1 and 2 goals in 26%, 30% and 22% of the matches, and six or more in only 2.8% (the highest was 31). On average the home team scored 1.62 goals and the away team 1.08, and the home team won 48.6% of the matches, against 27.8% for the away team.</w:t>
+        <w:t xml:space="preserve">We use the dataset International football results from 1872 by Mart Jürisoo (2026), published on Kaggle. The author keeps it up to date on GitHub, where we downloaded our copy on 13 October 2026. The main file, results.csv, has 49,945 men’s international matches from 30 November 1872 to 6 October 2026, with nine columns: the date, the home team, the away team, the home score, the away score, the tournament, the city, the country and whether the venue was neutral. The two scores are our targets; they are whole numbers from 0 and up. The file has no missing values and no duplicated rows. A second file lists 36 former team names (for example Dahomey for Benin), and the files with goal scorers and penalty shoot-outs were not needed.</w:t>
+      </w:r>
+    </w:p>
+    <w:p>
+      <w:r>
+        <w:t xml:space="preserve">The dataset only contains results, so all the features had to be built by us from the earlier matches of each team (section 4.2). The scores are small and skewed. In our training data (1994 to August 2023) the home team scored 0, 1 and 2 goals in 26%, 30% and 22% of the matches, and six or more in only 2.8% (the highest was 31). On average the home team scored 1.62 goals and the away team 1.08, and the home team won 48.6% of the matches, against 27.8% for the away team.</w:t>
       </w:r>
     </w:p>
     <w:p>
@@ -317,25 +285,7 @@
     </w:p>
     <w:p>
       <w:r>
-        <w:t xml:space="preserve">We built the 17 features in Table 1 ourselves. The most important rule was that a feature may only use matches that were played before the match it describes. </w:t>
-      </w:r>
-      <w:r>
-        <w:t>Otherwise,</w:t>
-      </w:r>
-      <w:r>
-        <w:t xml:space="preserve"> the model could see the </w:t>
-      </w:r>
-      <w:r>
-        <w:lastRenderedPageBreak/>
-        <w:t>result it is supposed to predict, which is data leakage. Our code goes through the matches in date order, and for every match it first reads the values of both teams and only then updates them with the result. Unit tests check this, for example that changing the score of a match changes no feature of that match or of any earlier match. In total the repository has 50 tests (</w:t>
-      </w:r>
-      <w:proofErr w:type="spellStart"/>
-      <w:r>
-        <w:t>pytest</w:t>
-      </w:r>
-      <w:proofErr w:type="spellEnd"/>
-      <w:r>
-        <w:t>).</w:t>
+        <w:t xml:space="preserve">We built the 17 features in Table 1 ourselves. The most important rule was that a feature may only use matches that were played before the match it describes. Otherwise, the model could see the result it is supposed to predict, which is data leakage. Our code goes through the matches in date order, and for every match it first reads the values of both teams and only then updates them with the result. Unit tests check this, for example that changing the score of a match changes no feature of that match or of any earlier match. In total the repository has 50 tests (pytest).</w:t>
       </w:r>
     </w:p>
     <w:p>
@@ -507,31 +457,13 @@
               <w:keepNext/>
               <w:spacing w:after="0" w:line="240" w:lineRule="auto"/>
             </w:pPr>
-            <w:proofErr w:type="spellStart"/>
-            <w:r>
-              <w:rPr>
-                <w:sz w:val="19"/>
-                <w:szCs w:val="19"/>
-              </w:rPr>
-              <w:t>elo_home</w:t>
-            </w:r>
-            <w:proofErr w:type="spellEnd"/>
-            <w:r>
-              <w:rPr>
-                <w:sz w:val="19"/>
-                <w:szCs w:val="19"/>
-              </w:rPr>
-              <w:t xml:space="preserve">, </w:t>
-            </w:r>
-            <w:proofErr w:type="spellStart"/>
-            <w:r>
-              <w:rPr>
-                <w:sz w:val="19"/>
-                <w:szCs w:val="19"/>
-              </w:rPr>
-              <w:t>elo_away</w:t>
-            </w:r>
-            <w:proofErr w:type="spellEnd"/>
+            <w:r>
+              <w:rPr>
+                <w:sz w:val="19"/>
+                <w:szCs w:val="19"/>
+              </w:rPr>
+              <w:t xml:space="preserve">elo_home, elo_away</w:t>
+            </w:r>
           </w:p>
         </w:tc>
         <w:tc>
@@ -593,31 +525,13 @@
               <w:keepNext/>
               <w:spacing w:after="0" w:line="240" w:lineRule="auto"/>
             </w:pPr>
-            <w:proofErr w:type="spellStart"/>
-            <w:r>
-              <w:rPr>
-                <w:sz w:val="19"/>
-                <w:szCs w:val="19"/>
-              </w:rPr>
-              <w:t>form_gf_home</w:t>
-            </w:r>
-            <w:proofErr w:type="spellEnd"/>
-            <w:r>
-              <w:rPr>
-                <w:sz w:val="19"/>
-                <w:szCs w:val="19"/>
-              </w:rPr>
-              <w:t xml:space="preserve">, </w:t>
-            </w:r>
-            <w:proofErr w:type="spellStart"/>
-            <w:r>
-              <w:rPr>
-                <w:sz w:val="19"/>
-                <w:szCs w:val="19"/>
-              </w:rPr>
-              <w:t>form_gf_away</w:t>
-            </w:r>
-            <w:proofErr w:type="spellEnd"/>
+            <w:r>
+              <w:rPr>
+                <w:sz w:val="19"/>
+                <w:szCs w:val="19"/>
+              </w:rPr>
+              <w:t xml:space="preserve">form_gf_home, form_gf_away</w:t>
+            </w:r>
           </w:p>
         </w:tc>
         <w:tc>
@@ -679,31 +593,13 @@
               <w:keepNext/>
               <w:spacing w:after="0" w:line="240" w:lineRule="auto"/>
             </w:pPr>
-            <w:proofErr w:type="spellStart"/>
-            <w:r>
-              <w:rPr>
-                <w:sz w:val="19"/>
-                <w:szCs w:val="19"/>
-              </w:rPr>
-              <w:t>form_ga_home</w:t>
-            </w:r>
-            <w:proofErr w:type="spellEnd"/>
-            <w:r>
-              <w:rPr>
-                <w:sz w:val="19"/>
-                <w:szCs w:val="19"/>
-              </w:rPr>
-              <w:t xml:space="preserve">, </w:t>
-            </w:r>
-            <w:proofErr w:type="spellStart"/>
-            <w:r>
-              <w:rPr>
-                <w:sz w:val="19"/>
-                <w:szCs w:val="19"/>
-              </w:rPr>
-              <w:t>form_ga_away</w:t>
-            </w:r>
-            <w:proofErr w:type="spellEnd"/>
+            <w:r>
+              <w:rPr>
+                <w:sz w:val="19"/>
+                <w:szCs w:val="19"/>
+              </w:rPr>
+              <w:t xml:space="preserve">form_ga_home, form_ga_away</w:t>
+            </w:r>
           </w:p>
         </w:tc>
         <w:tc>
@@ -765,31 +661,13 @@
               <w:keepNext/>
               <w:spacing w:after="0" w:line="240" w:lineRule="auto"/>
             </w:pPr>
-            <w:proofErr w:type="spellStart"/>
-            <w:r>
-              <w:rPr>
-                <w:sz w:val="19"/>
-                <w:szCs w:val="19"/>
-              </w:rPr>
-              <w:t>form_pts_home</w:t>
-            </w:r>
-            <w:proofErr w:type="spellEnd"/>
-            <w:r>
-              <w:rPr>
-                <w:sz w:val="19"/>
-                <w:szCs w:val="19"/>
-              </w:rPr>
-              <w:t xml:space="preserve">, </w:t>
-            </w:r>
-            <w:proofErr w:type="spellStart"/>
-            <w:r>
-              <w:rPr>
-                <w:sz w:val="19"/>
-                <w:szCs w:val="19"/>
-              </w:rPr>
-              <w:t>form_pts_away</w:t>
-            </w:r>
-            <w:proofErr w:type="spellEnd"/>
+            <w:r>
+              <w:rPr>
+                <w:sz w:val="19"/>
+                <w:szCs w:val="19"/>
+              </w:rPr>
+              <w:t xml:space="preserve">form_pts_home, form_pts_away</w:t>
+            </w:r>
           </w:p>
         </w:tc>
         <w:tc>
@@ -1055,7 +933,6 @@
               <w:keepNext/>
               <w:spacing w:after="0" w:line="240" w:lineRule="auto"/>
             </w:pPr>
-            <w:proofErr w:type="spellStart"/>
             <w:r>
               <w:rPr>
                 <w:sz w:val="19"/>
@@ -1063,7 +940,6 @@
               </w:rPr>
               <w:t>altitude_km</w:t>
             </w:r>
-            <w:proofErr w:type="spellEnd"/>
           </w:p>
         </w:tc>
         <w:tc>
@@ -1125,63 +1001,13 @@
               <w:keepNext/>
               <w:spacing w:after="0" w:line="240" w:lineRule="auto"/>
             </w:pPr>
-            <w:proofErr w:type="spellStart"/>
-            <w:r>
-              <w:rPr>
-                <w:sz w:val="19"/>
-                <w:szCs w:val="19"/>
-              </w:rPr>
-              <w:t>is_world_cup</w:t>
-            </w:r>
-            <w:proofErr w:type="spellEnd"/>
-            <w:r>
-              <w:rPr>
-                <w:sz w:val="19"/>
-                <w:szCs w:val="19"/>
-              </w:rPr>
-              <w:t xml:space="preserve">, </w:t>
-            </w:r>
-            <w:proofErr w:type="spellStart"/>
-            <w:r>
-              <w:rPr>
-                <w:sz w:val="19"/>
-                <w:szCs w:val="19"/>
-              </w:rPr>
-              <w:t>is_continental_final</w:t>
-            </w:r>
-            <w:proofErr w:type="spellEnd"/>
-            <w:r>
-              <w:rPr>
-                <w:sz w:val="19"/>
-                <w:szCs w:val="19"/>
-              </w:rPr>
-              <w:t xml:space="preserve">, </w:t>
-            </w:r>
-            <w:proofErr w:type="spellStart"/>
-            <w:r>
-              <w:rPr>
-                <w:sz w:val="19"/>
-                <w:szCs w:val="19"/>
-              </w:rPr>
-              <w:t>is_qualifier</w:t>
-            </w:r>
-            <w:proofErr w:type="spellEnd"/>
-            <w:r>
-              <w:rPr>
-                <w:sz w:val="19"/>
-                <w:szCs w:val="19"/>
-              </w:rPr>
-              <w:t xml:space="preserve">, </w:t>
-            </w:r>
-            <w:proofErr w:type="spellStart"/>
-            <w:r>
-              <w:rPr>
-                <w:sz w:val="19"/>
-                <w:szCs w:val="19"/>
-              </w:rPr>
-              <w:t>is_other_tournament</w:t>
-            </w:r>
-            <w:proofErr w:type="spellEnd"/>
+            <w:r>
+              <w:rPr>
+                <w:sz w:val="19"/>
+                <w:szCs w:val="19"/>
+              </w:rPr>
+              <w:t xml:space="preserve">is_world_cup, is_continental_final, is_qualifier, is_other_tournament</w:t>
+            </w:r>
           </w:p>
         </w:tc>
         <w:tc>
@@ -1292,23 +1118,7 @@
     </w:p>
     <w:p>
       <w:r>
-        <w:t xml:space="preserve">Altitude was not in our first plan; we added it after seeing the gaps of Bolivia and Ecuador in Figure 1. The difference between the two Elo ratings was not used as a feature, because it is exactly </w:t>
-      </w:r>
-      <w:proofErr w:type="spellStart"/>
-      <w:r>
-        <w:t>elo_home</w:t>
-      </w:r>
-      <w:proofErr w:type="spellEnd"/>
-      <w:r>
-        <w:t xml:space="preserve"> minus </w:t>
-      </w:r>
-      <w:proofErr w:type="spellStart"/>
-      <w:r>
-        <w:t>elo_away</w:t>
-      </w:r>
-      <w:proofErr w:type="spellEnd"/>
-      <w:r>
-        <w:t xml:space="preserve"> and would make the matrix in the normal equation (section 5.1) singular.</w:t>
+        <w:t xml:space="preserve">Altitude was not in our first plan; we added it after seeing the gaps of Bolivia and Ecuador in Figure 1. The difference between the two Elo ratings was not used as a feature, because it is exactly elo_home minus elo_away and would make the matrix in the normal equation (section 5.1) singular.</w:t>
       </w:r>
     </w:p>
     <w:p>
@@ -1334,7 +1144,6 @@
         <w:pStyle w:val="Heading1"/>
       </w:pPr>
       <w:r>
-        <w:lastRenderedPageBreak/>
         <w:t>5. Methods</w:t>
       </w:r>
     </w:p>
@@ -1348,27 +1157,7 @@
     </w:p>
     <w:p>
       <w:r>
-        <w:t xml:space="preserve">Our first algorithm is linear regression, which we wrote ourselves in the class </w:t>
-      </w:r>
-      <w:proofErr w:type="spellStart"/>
-      <w:r>
-        <w:t>LinearRegressionScratch</w:t>
-      </w:r>
-      <w:proofErr w:type="spellEnd"/>
-      <w:r>
-        <w:t xml:space="preserve"> (</w:t>
-      </w:r>
-      <w:proofErr w:type="spellStart"/>
-      <w:r>
-        <w:t>src</w:t>
-      </w:r>
-      <w:proofErr w:type="spellEnd"/>
-      <w:r>
-        <w:t xml:space="preserve">/linear_regression.py) using only NumPy. The input is a matrix X with one row per match and the 17 features as columns (m × 17), and the output is a matrix Y with two columns, the home goals and the away goals. The model adds a column of ones to X for the intercept (we call the result </w:t>
-      </w:r>
-      <w:proofErr w:type="spellStart"/>
-      <w:r>
-        <w:t>X</w:t>
+        <w:t xml:space="preserve">Our first algorithm is linear regression, which we wrote ourselves in the class LinearRegressionScratch (notebook section 7.2) using only NumPy. The input is a matrix X with one row per match and the 17 features as columns (m × 17), and the output is a matrix Y with two columns, the home goals and the away goals. The model adds a column of ones to X for the intercept (we call the result X</w:t>
       </w:r>
       <w:r>
         <w:rPr>
@@ -1376,7 +1165,6 @@
         </w:rPr>
         <w:t>b</w:t>
       </w:r>
-      <w:proofErr w:type="spellEnd"/>
       <w:r>
         <w:t>) and predicts both targets at once:</w:t>
       </w:r>
@@ -1390,14 +1178,7 @@
         <w:rPr>
           <w:rFonts w:ascii="Cambria Math" w:eastAsia="Cambria Math" w:hAnsi="Cambria Math" w:cs="Cambria Math"/>
         </w:rPr>
-        <w:t xml:space="preserve">Ŷ = </w:t>
-      </w:r>
-      <w:proofErr w:type="spellStart"/>
-      <w:r>
-        <w:rPr>
-          <w:rFonts w:ascii="Cambria Math" w:eastAsia="Cambria Math" w:hAnsi="Cambria Math" w:cs="Cambria Math"/>
-        </w:rPr>
-        <w:t>X</w:t>
+        <w:t xml:space="preserve">Ŷ = X</w:t>
       </w:r>
       <w:r>
         <w:rPr>
@@ -1406,7 +1187,6 @@
         </w:rPr>
         <w:t>b</w:t>
       </w:r>
-      <w:proofErr w:type="spellEnd"/>
       <w:r>
         <w:rPr>
           <w:rFonts w:ascii="Cambria Math" w:eastAsia="Cambria Math" w:hAnsi="Cambria Math" w:cs="Cambria Math"/>
@@ -1416,23 +1196,7 @@
     </w:p>
     <w:p>
       <w:r>
-        <w:t>Here θ has 18 rows (the intercept and one weight per feature) and one column per target, which gives the same result as two separate regressions on the same features; we checked this in a test. The model minimises the mean squared error (MSE) plus an L2 penalty (ridge regression), where λ sets the strength of the penalty and the intercept is not penalised (</w:t>
-      </w:r>
-      <w:proofErr w:type="spellStart"/>
-      <w:r>
-        <w:t>Géron</w:t>
-      </w:r>
-      <w:proofErr w:type="spellEnd"/>
-      <w:r>
-        <w:t xml:space="preserve">, 2019, ch. 4). For each target column </w:t>
-      </w:r>
-      <w:proofErr w:type="gramStart"/>
-      <w:r>
-        <w:t>k</w:t>
-      </w:r>
-      <w:proofErr w:type="gramEnd"/>
-      <w:r>
-        <w:t xml:space="preserve"> the cost is</w:t>
+        <w:t xml:space="preserve">Here θ has 18 rows (the intercept and one weight per feature) and one column per target, which gives the same result as two separate regressions on the same features; we checked this in a test. The model minimises the mean squared error (MSE) plus an L2 penalty (ridge regression), where λ sets the strength of the penalty and the intercept is not penalised (Géron, 2019, ch. 4). For each target column k the cost is</w:t>
       </w:r>
     </w:p>
     <w:p>
@@ -1444,14 +1208,7 @@
         <w:rPr>
           <w:rFonts w:ascii="Cambria Math" w:eastAsia="Cambria Math" w:hAnsi="Cambria Math" w:cs="Cambria Math"/>
         </w:rPr>
-        <w:t>J(</w:t>
-      </w:r>
-      <w:proofErr w:type="spellStart"/>
-      <w:r>
-        <w:rPr>
-          <w:rFonts w:ascii="Cambria Math" w:eastAsia="Cambria Math" w:hAnsi="Cambria Math" w:cs="Cambria Math"/>
-        </w:rPr>
-        <w:t>θ</w:t>
+        <w:t>J(θ</w:t>
       </w:r>
       <w:r>
         <w:rPr>
@@ -1460,19 +1217,11 @@
         </w:rPr>
         <w:t>k</w:t>
       </w:r>
-      <w:proofErr w:type="spellEnd"/>
       <w:r>
         <w:rPr>
           <w:rFonts w:ascii="Cambria Math" w:eastAsia="Cambria Math" w:hAnsi="Cambria Math" w:cs="Cambria Math"/>
         </w:rPr>
-        <w:t xml:space="preserve">) = (1/m) </w:t>
-      </w:r>
-      <w:proofErr w:type="spellStart"/>
-      <w:r>
-        <w:rPr>
-          <w:rFonts w:ascii="Cambria Math" w:eastAsia="Cambria Math" w:hAnsi="Cambria Math" w:cs="Cambria Math"/>
-        </w:rPr>
-        <w:t>Σ</w:t>
+        <w:t xml:space="preserve">) = (1/m) Σ</w:t>
       </w:r>
       <w:r>
         <w:rPr>
@@ -1481,19 +1230,11 @@
         </w:rPr>
         <w:t>i</w:t>
       </w:r>
-      <w:proofErr w:type="spellEnd"/>
       <w:r>
         <w:rPr>
           <w:rFonts w:ascii="Cambria Math" w:eastAsia="Cambria Math" w:hAnsi="Cambria Math" w:cs="Cambria Math"/>
         </w:rPr>
-        <w:t xml:space="preserve"> (</w:t>
-      </w:r>
-      <w:proofErr w:type="spellStart"/>
-      <w:r>
-        <w:rPr>
-          <w:rFonts w:ascii="Cambria Math" w:eastAsia="Cambria Math" w:hAnsi="Cambria Math" w:cs="Cambria Math"/>
-        </w:rPr>
-        <w:t>ŷ</w:t>
+        <w:t xml:space="preserve"> (ŷ</w:t>
       </w:r>
       <w:r>
         <w:rPr>
@@ -1502,19 +1243,11 @@
         </w:rPr>
         <w:t>ik</w:t>
       </w:r>
-      <w:proofErr w:type="spellEnd"/>
       <w:r>
         <w:rPr>
           <w:rFonts w:ascii="Cambria Math" w:eastAsia="Cambria Math" w:hAnsi="Cambria Math" w:cs="Cambria Math"/>
         </w:rPr>
-        <w:t xml:space="preserve"> − </w:t>
-      </w:r>
-      <w:proofErr w:type="spellStart"/>
-      <w:r>
-        <w:rPr>
-          <w:rFonts w:ascii="Cambria Math" w:eastAsia="Cambria Math" w:hAnsi="Cambria Math" w:cs="Cambria Math"/>
-        </w:rPr>
-        <w:t>y</w:t>
+        <w:t xml:space="preserve"> − y</w:t>
       </w:r>
       <w:r>
         <w:rPr>
@@ -1523,7 +1256,6 @@
         </w:rPr>
         <w:t>ik</w:t>
       </w:r>
-      <w:proofErr w:type="spellEnd"/>
       <w:r>
         <w:rPr>
           <w:rFonts w:ascii="Cambria Math" w:eastAsia="Cambria Math" w:hAnsi="Cambria Math" w:cs="Cambria Math"/>
@@ -1541,45 +1273,14 @@
         <w:rPr>
           <w:rFonts w:ascii="Cambria Math" w:eastAsia="Cambria Math" w:hAnsi="Cambria Math" w:cs="Cambria Math"/>
         </w:rPr>
-        <w:t xml:space="preserve"> + λ </w:t>
-      </w:r>
-      <w:proofErr w:type="spellStart"/>
-      <w:r>
-        <w:rPr>
-          <w:rFonts w:ascii="Cambria Math" w:eastAsia="Cambria Math" w:hAnsi="Cambria Math" w:cs="Cambria Math"/>
-        </w:rPr>
-        <w:t>Σ</w:t>
+        <w:t xml:space="preserve"> + λ Σ</w:t>
       </w:r>
       <w:r>
         <w:rPr>
           <w:rFonts w:ascii="Cambria Math" w:eastAsia="Cambria Math" w:hAnsi="Cambria Math" w:cs="Cambria Math"/>
           <w:vertAlign w:val="subscript"/>
         </w:rPr>
-        <w:t>j</w:t>
-      </w:r>
-      <w:proofErr w:type="spellEnd"/>
-      <w:r>
-        <w:rPr>
-          <w:rFonts w:ascii="Cambria Math" w:eastAsia="Cambria Math" w:hAnsi="Cambria Math" w:cs="Cambria Math"/>
-          <w:vertAlign w:val="subscript"/>
-        </w:rPr>
-        <w:t>=</w:t>
-      </w:r>
-      <w:proofErr w:type="gramStart"/>
-      <w:r>
-        <w:rPr>
-          <w:rFonts w:ascii="Cambria Math" w:eastAsia="Cambria Math" w:hAnsi="Cambria Math" w:cs="Cambria Math"/>
-          <w:vertAlign w:val="subscript"/>
-        </w:rPr>
-        <w:t>1..</w:t>
-      </w:r>
-      <w:proofErr w:type="gramEnd"/>
-      <w:r>
-        <w:rPr>
-          <w:rFonts w:ascii="Cambria Math" w:eastAsia="Cambria Math" w:hAnsi="Cambria Math" w:cs="Cambria Math"/>
-          <w:vertAlign w:val="subscript"/>
-        </w:rPr>
-        <w:t>17</w:t>
+        <w:t>j=1..17</w:t>
       </w:r>
       <w:r>
         <w:rPr>
@@ -1623,9 +1324,20 @@
         <w:t>Normal equation.</w:t>
       </w:r>
       <w:r>
-        <w:t xml:space="preserve"> Setting the gradient of the cost to zero gives (</w:t>
-      </w:r>
-      <w:proofErr w:type="spellStart"/>
+        <w:t xml:space="preserve"> Setting the gradient of the cost to zero gives (X</w:t>
+      </w:r>
+      <w:r>
+        <w:rPr>
+          <w:vertAlign w:val="subscript"/>
+        </w:rPr>
+        <w:t>b</w:t>
+      </w:r>
+      <w:r>
+        <w:rPr>
+          <w:vertAlign w:val="superscript"/>
+        </w:rPr>
+        <w:t>T</w:t>
+      </w:r>
       <w:r>
         <w:t>X</w:t>
       </w:r>
@@ -1636,67 +1348,22 @@
         <w:t>b</w:t>
       </w:r>
       <w:r>
+        <w:t xml:space="preserve"> + mλI*) θ = X</w:t>
+      </w:r>
+      <w:r>
+        <w:rPr>
+          <w:vertAlign w:val="subscript"/>
+        </w:rPr>
+        <w:t>b</w:t>
+      </w:r>
+      <w:r>
         <w:rPr>
           <w:vertAlign w:val="superscript"/>
         </w:rPr>
         <w:t>T</w:t>
       </w:r>
       <w:r>
-        <w:t>X</w:t>
-      </w:r>
-      <w:r>
-        <w:rPr>
-          <w:vertAlign w:val="subscript"/>
-        </w:rPr>
-        <w:t>b</w:t>
-      </w:r>
-      <w:proofErr w:type="spellEnd"/>
-      <w:r>
-        <w:t xml:space="preserve"> + </w:t>
-      </w:r>
-      <w:proofErr w:type="spellStart"/>
-      <w:r>
-        <w:t>mλI</w:t>
-      </w:r>
-      <w:proofErr w:type="spellEnd"/>
-      <w:r>
-        <w:t xml:space="preserve">*) θ = </w:t>
-      </w:r>
-      <w:proofErr w:type="spellStart"/>
-      <w:r>
-        <w:t>X</w:t>
-      </w:r>
-      <w:r>
-        <w:rPr>
-          <w:vertAlign w:val="subscript"/>
-        </w:rPr>
-        <w:t>b</w:t>
-      </w:r>
-      <w:r>
-        <w:rPr>
-          <w:vertAlign w:val="superscript"/>
-        </w:rPr>
-        <w:t>T</w:t>
-      </w:r>
-      <w:r>
-        <w:t>Y</w:t>
-      </w:r>
-      <w:proofErr w:type="spellEnd"/>
-      <w:r>
-        <w:t xml:space="preserve">, where I* is the identity matrix with a 0 for the intercept. Instead of calculating the inverse of the matrix, which is slower and less accurate, we solve this system with </w:t>
-      </w:r>
-      <w:proofErr w:type="spellStart"/>
-      <w:proofErr w:type="gramStart"/>
-      <w:r>
-        <w:t>np.linalg</w:t>
-      </w:r>
-      <w:proofErr w:type="gramEnd"/>
-      <w:r>
-        <w:t>.solve</w:t>
-      </w:r>
-      <w:proofErr w:type="spellEnd"/>
-      <w:r>
-        <w:t>. It gives the exact optimum in a fraction of a second, and it is the method used for our final model.</w:t>
+        <w:t xml:space="preserve">Y, where I* is the identity matrix with a 0 for the intercept. Instead of calculating the inverse of the matrix, which is slower and less accurate, we solve this system with np.linalg.solve. It gives the exact optimum in a fraction of a second, and it is the method we use to fit the linear regression.</w:t>
       </w:r>
     </w:p>
     <w:p>
@@ -1715,10 +1382,58 @@
         <w:t>Batch gradient descent.</w:t>
       </w:r>
       <w:r>
-        <w:t xml:space="preserve"> Starting from θ = 0, the model repeatedly takes a step against the gradient: θ ← θ − η [(2/m) </w:t>
-      </w:r>
-      <w:proofErr w:type="spellStart"/>
-      <w:proofErr w:type="gramStart"/>
+        <w:t xml:space="preserve"> Starting from θ = 0, the model repeatedly takes a step against the gradient: θ ← θ − η [(2/m) X</w:t>
+      </w:r>
+      <w:r>
+        <w:rPr>
+          <w:vertAlign w:val="subscript"/>
+        </w:rPr>
+        <w:t>b</w:t>
+      </w:r>
+      <w:r>
+        <w:rPr>
+          <w:vertAlign w:val="superscript"/>
+        </w:rPr>
+        <w:t>T</w:t>
+      </w:r>
+      <w:r>
+        <w:t>(X</w:t>
+      </w:r>
+      <w:r>
+        <w:rPr>
+          <w:vertAlign w:val="subscript"/>
+        </w:rPr>
+        <w:t>b</w:t>
+      </w:r>
+      <w:r>
+        <w:t xml:space="preserve">θ − Y) + 2λI*θ], where η is the learning rate. It stops when the cost improves by less than 10</w:t>
+      </w:r>
+      <w:r>
+        <w:rPr>
+          <w:vertAlign w:val="superscript"/>
+        </w:rPr>
+        <w:t>−10</w:t>
+      </w:r>
+      <w:r>
+        <w:t xml:space="preserve"> or after a maximum number of iterations, and it stops with an error message if the cost starts to grow, which means that the learning rate is too large.</w:t>
+      </w:r>
+    </w:p>
+    <w:p>
+      <w:r>
+        <w:t xml:space="preserve">Before fitting, the model standardises every feature with the training mean and standard deviation and stores them, so that new data is scaled the same way in predict. Without this, gradient descent would hardly move, since the Elo ratings are around 1,500 while most other features are between 0 and 3. After standardisation the largest eigenvalue of X</w:t>
+      </w:r>
+      <w:r>
+        <w:rPr>
+          <w:vertAlign w:val="subscript"/>
+        </w:rPr>
+        <w:t>b</w:t>
+      </w:r>
+      <w:r>
+        <w:rPr>
+          <w:vertAlign w:val="superscript"/>
+        </w:rPr>
+        <w:t>T</w:t>
+      </w:r>
       <w:r>
         <w:t>X</w:t>
       </w:r>
@@ -1728,74 +1443,6 @@
         </w:rPr>
         <w:t>b</w:t>
       </w:r>
-      <w:r>
-        <w:rPr>
-          <w:vertAlign w:val="superscript"/>
-        </w:rPr>
-        <w:t>T</w:t>
-      </w:r>
-      <w:proofErr w:type="spellEnd"/>
-      <w:r>
-        <w:t>(</w:t>
-      </w:r>
-      <w:proofErr w:type="spellStart"/>
-      <w:proofErr w:type="gramEnd"/>
-      <w:r>
-        <w:t>X</w:t>
-      </w:r>
-      <w:r>
-        <w:rPr>
-          <w:vertAlign w:val="subscript"/>
-        </w:rPr>
-        <w:t>b</w:t>
-      </w:r>
-      <w:r>
-        <w:t>θ</w:t>
-      </w:r>
-      <w:proofErr w:type="spellEnd"/>
-      <w:r>
-        <w:t xml:space="preserve"> − Y) + 2λI*θ], where η is the learning rate. It stops when the cost improves by less than 10</w:t>
-      </w:r>
-      <w:r>
-        <w:rPr>
-          <w:vertAlign w:val="superscript"/>
-        </w:rPr>
-        <w:t>−10</w:t>
-      </w:r>
-      <w:r>
-        <w:t xml:space="preserve"> or after a maximum number of iterations, and it stops with an error message if the cost starts to grow, which means that the learning rate is too large.</w:t>
-      </w:r>
-    </w:p>
-    <w:p>
-      <w:r>
-        <w:t xml:space="preserve">Before fitting, the model standardises every feature with the training mean and standard deviation and stores them, so that new data is scaled the same way in predict. Without this, gradient descent would hardly move, since the Elo ratings are around 1,500 while most other features are between 0 and 3. After standardisation the largest eigenvalue of </w:t>
-      </w:r>
-      <w:proofErr w:type="spellStart"/>
-      <w:r>
-        <w:t>X</w:t>
-      </w:r>
-      <w:r>
-        <w:rPr>
-          <w:vertAlign w:val="subscript"/>
-        </w:rPr>
-        <w:t>b</w:t>
-      </w:r>
-      <w:r>
-        <w:rPr>
-          <w:vertAlign w:val="superscript"/>
-        </w:rPr>
-        <w:t>T</w:t>
-      </w:r>
-      <w:r>
-        <w:t>X</w:t>
-      </w:r>
-      <w:r>
-        <w:rPr>
-          <w:vertAlign w:val="subscript"/>
-        </w:rPr>
-        <w:t>b</w:t>
-      </w:r>
-      <w:proofErr w:type="spellEnd"/>
       <w:r>
         <w:t>/m is 3.70, so gradient descent converges for learning rates below 1/3.70 ≈ 0.27. Figure 2 confirms this: the larger the learning rate, the faster the cost reaches its minimum, while with η = 0.3 the cost exploded after 49 iterations. With η = 0.1 and a stricter tolerance of 10</w:t>
       </w:r>
@@ -1828,7 +1475,6 @@
         <w:rPr>
           <w:noProof/>
         </w:rPr>
-        <w:lastRenderedPageBreak/>
         <w:drawing>
           <wp:inline distT="0" distB="0" distL="0" distR="0" wp14:anchorId="10E7EE02" wp14:editId="2CA27EAC">
             <wp:extent cx="3810000" cy="1590675"/>
@@ -1903,41 +1549,12 @@
         <w:pStyle w:val="Heading2"/>
       </w:pPr>
       <w:r>
-        <w:t xml:space="preserve">5.2 Algorithm 2: </w:t>
-      </w:r>
-      <w:proofErr w:type="gramStart"/>
-      <w:r>
-        <w:t>Random forest</w:t>
-      </w:r>
-      <w:proofErr w:type="gramEnd"/>
-    </w:p>
-    <w:p>
-      <w:r>
-        <w:t xml:space="preserve">Our second algorithm is the </w:t>
-      </w:r>
-      <w:proofErr w:type="spellStart"/>
-      <w:r>
-        <w:t>RandomForestRegressor</w:t>
-      </w:r>
-      <w:proofErr w:type="spellEnd"/>
-      <w:r>
-        <w:t xml:space="preserve"> from scikit-learn. A random forest is an average of many decision trees (</w:t>
-      </w:r>
-      <w:proofErr w:type="spellStart"/>
-      <w:r>
-        <w:t>Breiman</w:t>
-      </w:r>
-      <w:proofErr w:type="spellEnd"/>
-      <w:r>
-        <w:t>, 2001). Every tree is trained on a bootstrap sample of the training matches, drawn with replacement, and at every split it only looks at a random subset of the features. A single deep tree overfits, but since the trees differ from each other, their errors partly cancel out when they are averaged (</w:t>
-      </w:r>
-      <w:proofErr w:type="spellStart"/>
-      <w:r>
-        <w:t>Géron</w:t>
-      </w:r>
-      <w:proofErr w:type="spellEnd"/>
-      <w:r>
-        <w:t>, 2019, ch. 7). Unlike linear regression, a forest can learn non-linear effects and interactions, for example that the home advantage is different for strong and weak teams. Every leaf stores the mean home and away goals of its training matches, so one forest predicts both scores, and since its predictions are averages of real scores, they can never be negative.</w:t>
+        <w:t xml:space="preserve">5.2 Algorithm 2: Random forest</w:t>
+      </w:r>
+    </w:p>
+    <w:p>
+      <w:r>
+        <w:t xml:space="preserve">Our second algorithm is the RandomForestRegressor from scikit-learn. A random forest is an average of many decision trees (Breiman, 2001). Every tree is trained on a bootstrap sample of the training matches, drawn with replacement, and at every split it only looks at a random subset of the features. A single deep tree overfits, but since the trees differ from each other, their errors partly cancel out when they are averaged (Géron, 2019, ch. 7). Unlike linear regression, a forest can learn non-linear effects and interactions, for example that the home advantage is different for strong and weak teams. Every leaf stores the mean home and away goals of its training matches, so one forest predicts both scores, and since its predictions are averages of real scores, they can never be negative.</w:t>
       </w:r>
     </w:p>
     <w:p>
@@ -1950,20 +1567,12 @@
     </w:p>
     <w:p>
       <w:r>
-        <w:t>Both models were tuned on the training data only, with the same five time-series folds (</w:t>
-      </w:r>
-      <w:proofErr w:type="spellStart"/>
-      <w:r>
-        <w:t>TimeSeriesSplit</w:t>
-      </w:r>
-      <w:proofErr w:type="spellEnd"/>
-      <w:r>
-        <w:t>). The training period is divided into six blocks in date order; the first fold trains on block 1 and validates on block 2, the second trains on blocks 1–2 and validates on block 3, and so on. The model is therefore always validated on later matches than it was trained on, just like in the real test. The score is the RMSE, averaged over home and away goals.</w:t>
-      </w:r>
-    </w:p>
-    <w:p>
-      <w:r>
-        <w:t>For the linear regression we tried six values of λ (0, 0.001, 0.01, 0.1, 1 and 10) with our own loop over the folds. For the random forest we ran a grid search over 54 combinations: the number of trees (200 or 500), the maximum depth (none, 10 or 20), the smallest number of matches in a leaf (1, 5 or 20) and the share of the features tried at each split (all, half, or the square root of the number, 4 of 17). That is 270 forests, which took about 20 minutes on our laptops, so the result is saved in the repository together with a fingerprint of the training data, and the notebook only reuses it if the data has not changed.</w:t>
+        <w:t>Both models were tuned on the training data only, with the same five time-series folds (TimeSeriesSplit). The training period is divided into six blocks in date order; the first fold trains on block 1 and validates on block 2, the second trains on blocks 1–2 and validates on block 3, and so on. The model is therefore always validated on later matches than it was trained on, just like in the real test. The score is the RMSE, averaged over home and away goals.</w:t>
+      </w:r>
+    </w:p>
+    <w:p>
+      <w:r>
+        <w:t>For the linear regression we tried six values of λ (0, 0.001, 0.01, 0.1, 1 and 10) with our own loop over the folds. For the random forest we ran a grid search over 54 combinations: the number of trees (200 or 500), the maximum depth (none, 10 or 20), the smallest number of matches in a leaf (1, 5 or 20) and the share of the features tried at each split (all, half, or the square root of the number, 4 of 17). That is 270 forests, which took about 20 minutes on our laptops, so the result is saved together with a fingerprint of the training data; if the saved result is missing or the data has changed, the notebook runs the full search itself. The same five folds were then used to choose between the two tuned algorithms (section 6.1), before the test set was used.</w:t>
       </w:r>
     </w:p>
     <w:p>
@@ -1976,11 +1585,7 @@
     </w:p>
     <w:p>
       <w:r>
-        <w:t xml:space="preserve">We use the regression metrics from the guidelines, MAE, MSE, RMSE and R², for home goals, away goals and their average. We compare the models with two baselines: the mean baseline always predicts the average home and away goals of the training data (1.62 and 1.08), and the venue baseline the averages of the training matches with the same kind of venue (home ground or neutral). To make the results easier to read, we also turn the predicted scores into a result (home win, draw or away win, where a draw is predicted when the difference is smaller than a draw band </w:t>
-      </w:r>
-      <w:r>
-        <w:lastRenderedPageBreak/>
-        <w:t>chosen on the training data), and we count how often the exact score is right after rounding, with negative predictions set to 0. Finally, a paired bootstrap with 2,000 resamples of the test matches shows how certain the differences between the models are, and permutation importance shows which features the models rely on.</w:t>
+        <w:t xml:space="preserve">We use the regression metrics from the guidelines, MAE, MSE, RMSE and R², for home goals, away goals and their average. We compare the models with two baselines: the mean baseline always predicts the average home and away goals of the training data (1.62 and 1.08), and the venue baseline the averages of the training matches with the same kind of venue (home ground or neutral). To make the results easier to read, we also turn the predicted scores into a result (home win, draw or away win, where a draw is predicted when the difference is smaller than a draw band chosen on the training data), and we count how often the exact score is right after rounding, with negative predictions set to 0. Finally, a paired bootstrap with 2,000 resamples of the test matches shows how certain the differences between the models are, and permutation importance shows which features the models rely on.</w:t>
       </w:r>
     </w:p>
     <w:p>
@@ -1992,8 +1597,16 @@
       </w:r>
     </w:p>
     <w:p>
-      <w:r>
-        <w:t>Table 2 shows the results of the two baselines and the two tuned models on the test data, and Figure 3 shows the RMSE, our main metric.</w:t>
+      <w:pPr>
+        <w:pStyle w:val="Heading2"/>
+      </w:pPr>
+      <w:r>
+        <w:t>6.1 Tuning, overfitting and the choice of the final model</w:t>
+      </w:r>
+    </w:p>
+    <w:p>
+      <w:r>
+        <w:t xml:space="preserve">Everything in this section uses only the training period and its five time-series folds. The test set is not used until section 6.2.</w:t>
       </w:r>
     </w:p>
     <w:p>
@@ -2010,23 +1623,493 @@
         <w:t xml:space="preserve">Table 2. </w:t>
       </w:r>
       <w:r>
-        <w:t xml:space="preserve">Results on the test data. MAE, MSE and RMSE are averaged over home and away goals. W/D/L is the share of correctly predicted results and </w:t>
-      </w:r>
-      <w:proofErr w:type="gramStart"/>
-      <w:r>
-        <w:t>Exact</w:t>
-      </w:r>
-      <w:proofErr w:type="gramEnd"/>
-      <w:r>
-        <w:t xml:space="preserve"> the share of </w:t>
-      </w:r>
-      <w:proofErr w:type="gramStart"/>
-      <w:r>
-        <w:t>exactly correct</w:t>
-      </w:r>
-      <w:proofErr w:type="gramEnd"/>
-      <w:r>
-        <w:t xml:space="preserve"> scores. The best value in each column is in bold.</w:t>
+        <w:t>RMSE (average of home and away goals) on the whole training data and in the five validation folds (mean). The best validation value is in bold (a low training RMSE alone is not a good sign).</w:t>
+      </w:r>
+    </w:p>
+    <w:tbl>
+      <w:tblPr>
+        <w:tblW w:w="6126" w:type="dxa"/>
+        <w:jc w:val="center"/>
+        <w:tblBorders>
+          <w:top w:val="single" w:sz="4" w:space="0" w:color="auto"/>
+          <w:left w:val="single" w:sz="4" w:space="0" w:color="auto"/>
+          <w:bottom w:val="single" w:sz="4" w:space="0" w:color="auto"/>
+          <w:right w:val="single" w:sz="4" w:space="0" w:color="auto"/>
+          <w:insideH w:val="single" w:sz="4" w:space="0" w:color="auto"/>
+          <w:insideV w:val="single" w:sz="4" w:space="0" w:color="auto"/>
+        </w:tblBorders>
+        <w:tblLook w:val="04A0" w:firstRow="1" w:lastRow="0" w:firstColumn="1" w:lastColumn="0" w:noHBand="0" w:noVBand="1"/>
+      </w:tblPr>
+      <w:tblGrid>
+        <w:gridCol w:w="3226"/>
+        <w:gridCol w:w="1450"/>
+        <w:gridCol w:w="1450"/>
+      </w:tblGrid>
+      <w:tr>
+        <w:trPr>
+          <w:cantSplit/>
+          <w:tblHeader/>
+          <w:jc w:val="center"/>
+        </w:trPr>
+        <w:tc>
+          <w:tcPr>
+            <w:tcW w:w="3226" w:type="dxa"/>
+            <w:tcBorders>
+              <w:top w:val="single" w:sz="4" w:space="0" w:color="BFBFBF"/>
+              <w:left w:val="none" w:sz="0" w:space="0" w:color="FFFFFF"/>
+              <w:bottom w:val="single" w:sz="4" w:space="0" w:color="BFBFBF"/>
+              <w:right w:val="none" w:sz="0" w:space="0" w:color="FFFFFF"/>
+            </w:tcBorders>
+            <w:shd w:val="clear" w:color="auto" w:fill="EDEFF3"/>
+            <w:tcMar>
+              <w:top w:w="50" w:type="dxa"/>
+              <w:left w:w="100" w:type="dxa"/>
+              <w:bottom w:w="50" w:type="dxa"/>
+              <w:right w:w="100" w:type="dxa"/>
+            </w:tcMar>
+            <w:vAlign w:val="center"/>
+          </w:tcPr>
+          <w:p>
+            <w:pPr>
+              <w:keepNext/>
+              <w:spacing w:after="0" w:line="240" w:lineRule="auto"/>
+            </w:pPr>
+            <w:r>
+              <w:rPr>
+                <w:b/>
+                <w:bCs/>
+                <w:sz w:val="19"/>
+                <w:szCs w:val="19"/>
+              </w:rPr>
+              <w:t>Model</w:t>
+            </w:r>
+          </w:p>
+        </w:tc>
+        <w:tc>
+          <w:tcPr>
+            <w:tcW w:w="1450" w:type="dxa"/>
+            <w:tcBorders>
+              <w:top w:val="single" w:sz="4" w:space="0" w:color="BFBFBF"/>
+              <w:left w:val="none" w:sz="0" w:space="0" w:color="FFFFFF"/>
+              <w:bottom w:val="single" w:sz="4" w:space="0" w:color="BFBFBF"/>
+              <w:right w:val="none" w:sz="0" w:space="0" w:color="FFFFFF"/>
+            </w:tcBorders>
+            <w:shd w:val="clear" w:color="auto" w:fill="EDEFF3"/>
+            <w:tcMar>
+              <w:top w:w="50" w:type="dxa"/>
+              <w:left w:w="100" w:type="dxa"/>
+              <w:bottom w:w="50" w:type="dxa"/>
+              <w:right w:w="100" w:type="dxa"/>
+            </w:tcMar>
+            <w:vAlign w:val="center"/>
+          </w:tcPr>
+          <w:p>
+            <w:pPr>
+              <w:keepNext/>
+              <w:spacing w:after="0" w:line="240" w:lineRule="auto"/>
+              <w:jc w:val="center"/>
+            </w:pPr>
+            <w:r>
+              <w:rPr>
+                <w:b/>
+                <w:bCs/>
+                <w:sz w:val="19"/>
+                <w:szCs w:val="19"/>
+              </w:rPr>
+              <w:t>Training</w:t>
+            </w:r>
+          </w:p>
+        </w:tc>
+        <w:tc>
+          <w:tcPr>
+            <w:tcW w:w="1450" w:type="dxa"/>
+            <w:tcBorders>
+              <w:top w:val="single" w:sz="4" w:space="0" w:color="BFBFBF"/>
+              <w:left w:val="none" w:sz="0" w:space="0" w:color="FFFFFF"/>
+              <w:bottom w:val="single" w:sz="4" w:space="0" w:color="BFBFBF"/>
+              <w:right w:val="none" w:sz="0" w:space="0" w:color="FFFFFF"/>
+            </w:tcBorders>
+            <w:shd w:val="clear" w:color="auto" w:fill="EDEFF3"/>
+            <w:tcMar>
+              <w:top w:w="50" w:type="dxa"/>
+              <w:left w:w="100" w:type="dxa"/>
+              <w:bottom w:w="50" w:type="dxa"/>
+              <w:right w:w="100" w:type="dxa"/>
+            </w:tcMar>
+            <w:vAlign w:val="center"/>
+          </w:tcPr>
+          <w:p>
+            <w:pPr>
+              <w:keepNext/>
+              <w:spacing w:after="0" w:line="240" w:lineRule="auto"/>
+              <w:jc w:val="center"/>
+            </w:pPr>
+            <w:r>
+              <w:rPr>
+                <w:b/>
+                <w:bCs/>
+                <w:sz w:val="19"/>
+                <w:szCs w:val="19"/>
+              </w:rPr>
+              <w:t>Validation</w:t>
+            </w:r>
+          </w:p>
+        </w:tc>
+      </w:tr>
+      <w:tr>
+        <w:trPr>
+          <w:cantSplit/>
+          <w:jc w:val="center"/>
+        </w:trPr>
+        <w:tc>
+          <w:tcPr>
+            <w:tcW w:w="3226" w:type="dxa"/>
+            <w:tcBorders>
+              <w:top w:val="single" w:sz="4" w:space="0" w:color="BFBFBF"/>
+              <w:left w:val="none" w:sz="0" w:space="0" w:color="FFFFFF"/>
+              <w:bottom w:val="single" w:sz="4" w:space="0" w:color="BFBFBF"/>
+              <w:right w:val="none" w:sz="0" w:space="0" w:color="FFFFFF"/>
+            </w:tcBorders>
+            <w:tcMar>
+              <w:top w:w="50" w:type="dxa"/>
+              <w:left w:w="100" w:type="dxa"/>
+              <w:bottom w:w="50" w:type="dxa"/>
+              <w:right w:w="100" w:type="dxa"/>
+            </w:tcMar>
+            <w:vAlign w:val="center"/>
+          </w:tcPr>
+          <w:p>
+            <w:pPr>
+              <w:keepNext/>
+              <w:spacing w:after="0" w:line="240" w:lineRule="auto"/>
+            </w:pPr>
+            <w:r>
+              <w:rPr>
+                <w:sz w:val="19"/>
+                <w:szCs w:val="19"/>
+              </w:rPr>
+              <w:t>Linear regression (λ = 0.01)</w:t>
+            </w:r>
+          </w:p>
+        </w:tc>
+        <w:tc>
+          <w:tcPr>
+            <w:tcW w:w="1450" w:type="dxa"/>
+            <w:tcBorders>
+              <w:top w:val="single" w:sz="4" w:space="0" w:color="BFBFBF"/>
+              <w:left w:val="none" w:sz="0" w:space="0" w:color="FFFFFF"/>
+              <w:bottom w:val="single" w:sz="4" w:space="0" w:color="BFBFBF"/>
+              <w:right w:val="none" w:sz="0" w:space="0" w:color="FFFFFF"/>
+            </w:tcBorders>
+            <w:tcMar>
+              <w:top w:w="50" w:type="dxa"/>
+              <w:left w:w="100" w:type="dxa"/>
+              <w:bottom w:w="50" w:type="dxa"/>
+              <w:right w:w="100" w:type="dxa"/>
+            </w:tcMar>
+            <w:vAlign w:val="center"/>
+          </w:tcPr>
+          <w:p>
+            <w:pPr>
+              <w:keepNext/>
+              <w:spacing w:after="0" w:line="240" w:lineRule="auto"/>
+              <w:jc w:val="center"/>
+            </w:pPr>
+            <w:r>
+              <w:rPr>
+                <w:sz w:val="19"/>
+                <w:szCs w:val="19"/>
+              </w:rPr>
+              <w:t>1.266</w:t>
+            </w:r>
+          </w:p>
+        </w:tc>
+        <w:tc>
+          <w:tcPr>
+            <w:tcW w:w="1450" w:type="dxa"/>
+            <w:tcBorders>
+              <w:top w:val="single" w:sz="4" w:space="0" w:color="BFBFBF"/>
+              <w:left w:val="none" w:sz="0" w:space="0" w:color="FFFFFF"/>
+              <w:bottom w:val="single" w:sz="4" w:space="0" w:color="BFBFBF"/>
+              <w:right w:val="none" w:sz="0" w:space="0" w:color="FFFFFF"/>
+            </w:tcBorders>
+            <w:tcMar>
+              <w:top w:w="50" w:type="dxa"/>
+              <w:left w:w="100" w:type="dxa"/>
+              <w:bottom w:w="50" w:type="dxa"/>
+              <w:right w:w="100" w:type="dxa"/>
+            </w:tcMar>
+            <w:vAlign w:val="center"/>
+          </w:tcPr>
+          <w:p>
+            <w:pPr>
+              <w:keepNext/>
+              <w:spacing w:after="0" w:line="240" w:lineRule="auto"/>
+              <w:jc w:val="center"/>
+            </w:pPr>
+            <w:r>
+              <w:rPr>
+                <w:sz w:val="19"/>
+                <w:szCs w:val="19"/>
+              </w:rPr>
+              <w:t>1.253</w:t>
+            </w:r>
+          </w:p>
+        </w:tc>
+      </w:tr>
+      <w:tr>
+        <w:trPr>
+          <w:cantSplit/>
+          <w:jc w:val="center"/>
+        </w:trPr>
+        <w:tc>
+          <w:tcPr>
+            <w:tcW w:w="3226" w:type="dxa"/>
+            <w:tcBorders>
+              <w:top w:val="single" w:sz="4" w:space="0" w:color="BFBFBF"/>
+              <w:left w:val="none" w:sz="0" w:space="0" w:color="FFFFFF"/>
+              <w:bottom w:val="single" w:sz="4" w:space="0" w:color="BFBFBF"/>
+              <w:right w:val="none" w:sz="0" w:space="0" w:color="FFFFFF"/>
+            </w:tcBorders>
+            <w:tcMar>
+              <w:top w:w="50" w:type="dxa"/>
+              <w:left w:w="100" w:type="dxa"/>
+              <w:bottom w:w="50" w:type="dxa"/>
+              <w:right w:w="100" w:type="dxa"/>
+            </w:tcMar>
+            <w:vAlign w:val="center"/>
+          </w:tcPr>
+          <w:p>
+            <w:pPr>
+              <w:keepNext/>
+              <w:spacing w:after="0" w:line="240" w:lineRule="auto"/>
+            </w:pPr>
+            <w:r>
+              <w:rPr>
+                <w:sz w:val="19"/>
+                <w:szCs w:val="19"/>
+              </w:rPr>
+              <w:t>Random forest, default settings</w:t>
+            </w:r>
+          </w:p>
+        </w:tc>
+        <w:tc>
+          <w:tcPr>
+            <w:tcW w:w="1450" w:type="dxa"/>
+            <w:tcBorders>
+              <w:top w:val="single" w:sz="4" w:space="0" w:color="BFBFBF"/>
+              <w:left w:val="none" w:sz="0" w:space="0" w:color="FFFFFF"/>
+              <w:bottom w:val="single" w:sz="4" w:space="0" w:color="BFBFBF"/>
+              <w:right w:val="none" w:sz="0" w:space="0" w:color="FFFFFF"/>
+            </w:tcBorders>
+            <w:tcMar>
+              <w:top w:w="50" w:type="dxa"/>
+              <w:left w:w="100" w:type="dxa"/>
+              <w:bottom w:w="50" w:type="dxa"/>
+              <w:right w:w="100" w:type="dxa"/>
+            </w:tcMar>
+            <w:vAlign w:val="center"/>
+          </w:tcPr>
+          <w:p>
+            <w:pPr>
+              <w:keepNext/>
+              <w:spacing w:after="0" w:line="240" w:lineRule="auto"/>
+              <w:jc w:val="center"/>
+            </w:pPr>
+            <w:r>
+              <w:rPr>
+                <w:sz w:val="19"/>
+                <w:szCs w:val="19"/>
+              </w:rPr>
+              <w:t>0.475</w:t>
+            </w:r>
+          </w:p>
+        </w:tc>
+        <w:tc>
+          <w:tcPr>
+            <w:tcW w:w="1450" w:type="dxa"/>
+            <w:tcBorders>
+              <w:top w:val="single" w:sz="4" w:space="0" w:color="BFBFBF"/>
+              <w:left w:val="none" w:sz="0" w:space="0" w:color="FFFFFF"/>
+              <w:bottom w:val="single" w:sz="4" w:space="0" w:color="BFBFBF"/>
+              <w:right w:val="none" w:sz="0" w:space="0" w:color="FFFFFF"/>
+            </w:tcBorders>
+            <w:tcMar>
+              <w:top w:w="50" w:type="dxa"/>
+              <w:left w:w="100" w:type="dxa"/>
+              <w:bottom w:w="50" w:type="dxa"/>
+              <w:right w:w="100" w:type="dxa"/>
+            </w:tcMar>
+            <w:vAlign w:val="center"/>
+          </w:tcPr>
+          <w:p>
+            <w:pPr>
+              <w:keepNext/>
+              <w:spacing w:after="0" w:line="240" w:lineRule="auto"/>
+              <w:jc w:val="center"/>
+            </w:pPr>
+            <w:r>
+              <w:rPr>
+                <w:sz w:val="19"/>
+                <w:szCs w:val="19"/>
+              </w:rPr>
+              <w:t>1.275</w:t>
+            </w:r>
+          </w:p>
+        </w:tc>
+      </w:tr>
+      <w:tr>
+        <w:trPr>
+          <w:cantSplit/>
+          <w:jc w:val="center"/>
+        </w:trPr>
+        <w:tc>
+          <w:tcPr>
+            <w:tcW w:w="3226" w:type="dxa"/>
+            <w:tcBorders>
+              <w:top w:val="single" w:sz="4" w:space="0" w:color="BFBFBF"/>
+              <w:left w:val="none" w:sz="0" w:space="0" w:color="FFFFFF"/>
+              <w:bottom w:val="single" w:sz="4" w:space="0" w:color="BFBFBF"/>
+              <w:right w:val="none" w:sz="0" w:space="0" w:color="FFFFFF"/>
+            </w:tcBorders>
+            <w:tcMar>
+              <w:top w:w="50" w:type="dxa"/>
+              <w:left w:w="100" w:type="dxa"/>
+              <w:bottom w:w="50" w:type="dxa"/>
+              <w:right w:w="100" w:type="dxa"/>
+            </w:tcMar>
+            <w:vAlign w:val="center"/>
+          </w:tcPr>
+          <w:p>
+            <w:pPr>
+              <w:keepNext/>
+              <w:spacing w:after="0" w:line="240" w:lineRule="auto"/>
+            </w:pPr>
+            <w:r>
+              <w:rPr>
+                <w:sz w:val="19"/>
+                <w:szCs w:val="19"/>
+              </w:rPr>
+              <w:t>Random forest, tuned</w:t>
+            </w:r>
+          </w:p>
+        </w:tc>
+        <w:tc>
+          <w:tcPr>
+            <w:tcW w:w="1450" w:type="dxa"/>
+            <w:tcBorders>
+              <w:top w:val="single" w:sz="4" w:space="0" w:color="BFBFBF"/>
+              <w:left w:val="none" w:sz="0" w:space="0" w:color="FFFFFF"/>
+              <w:bottom w:val="single" w:sz="4" w:space="0" w:color="BFBFBF"/>
+              <w:right w:val="none" w:sz="0" w:space="0" w:color="FFFFFF"/>
+            </w:tcBorders>
+            <w:tcMar>
+              <w:top w:w="50" w:type="dxa"/>
+              <w:left w:w="100" w:type="dxa"/>
+              <w:bottom w:w="50" w:type="dxa"/>
+              <w:right w:w="100" w:type="dxa"/>
+            </w:tcMar>
+            <w:vAlign w:val="center"/>
+          </w:tcPr>
+          <w:p>
+            <w:pPr>
+              <w:keepNext/>
+              <w:spacing w:after="0" w:line="240" w:lineRule="auto"/>
+              <w:jc w:val="center"/>
+            </w:pPr>
+            <w:r>
+              <w:rPr>
+                <w:sz w:val="19"/>
+                <w:szCs w:val="19"/>
+              </w:rPr>
+              <w:t>1.153</w:t>
+            </w:r>
+          </w:p>
+        </w:tc>
+        <w:tc>
+          <w:tcPr>
+            <w:tcW w:w="1450" w:type="dxa"/>
+            <w:tcBorders>
+              <w:top w:val="single" w:sz="4" w:space="0" w:color="BFBFBF"/>
+              <w:left w:val="none" w:sz="0" w:space="0" w:color="FFFFFF"/>
+              <w:bottom w:val="single" w:sz="4" w:space="0" w:color="BFBFBF"/>
+              <w:right w:val="none" w:sz="0" w:space="0" w:color="FFFFFF"/>
+            </w:tcBorders>
+            <w:tcMar>
+              <w:top w:w="50" w:type="dxa"/>
+              <w:left w:w="100" w:type="dxa"/>
+              <w:bottom w:w="50" w:type="dxa"/>
+              <w:right w:w="100" w:type="dxa"/>
+            </w:tcMar>
+            <w:vAlign w:val="center"/>
+          </w:tcPr>
+          <w:p>
+            <w:pPr>
+              <w:keepNext/>
+              <w:spacing w:after="0" w:line="240" w:lineRule="auto"/>
+              <w:jc w:val="center"/>
+            </w:pPr>
+            <w:r>
+              <w:rPr>
+                <w:b/>
+                <w:bCs/>
+                <w:sz w:val="19"/>
+                <w:szCs w:val="19"/>
+              </w:rPr>
+              <w:t>1.243</w:t>
+            </w:r>
+          </w:p>
+        </w:tc>
+      </w:tr>
+    </w:tbl>
+    <w:p>
+      <w:pPr>
+        <w:spacing w:after="60"/>
+      </w:pPr>
+    </w:p>
+    <w:p>
+      <w:r>
+        <w:t>Table 2 shows that the linear regression does not overfit: the training and validation errors are very close (1.266 and 1.253). Regularisation therefore hardly matters. The best λ was 0.01, only 0.0002 better than no penalty, and every λ from 0.1 and up was worse in all five folds. With 25,266 matches and 17 features there is simply not much to overfit.</w:t>
+      </w:r>
+    </w:p>
+    <w:p>
+      <w:r>
+        <w:t>The random forest with default settings overfits a lot. Its trees grow until the leaves are pure (11,682 leaves per tree on average), so it almost learns the training matches by heart (training RMSE 0.475) but does worse on new matches (1.275 in validation). The grid search chose 500 trees, a maximum depth of 10, at least 5 matches per leaf and half of the features at each split. These trees have only 399 leaves on average, and the validation RMSE improved from 1.275 to 1.243, better than the linear regression (1.253), although the forest still overfits a little. The worst combinations in the grid had fully grown trees (one match per leaf and no or a high depth limit), while the best ones were very close: 21 of the 54 combinations were within 0.005 of the best.</w:t>
+      </w:r>
+    </w:p>
+    <w:p>
+      <w:r>
+        <w:t xml:space="preserve">Choosing the final model. With both algorithms tuned, we chose the final model on the same five folds, still without looking at the test set. The tuned forest has a lower validation RMSE than the linear regression in all five folds (1.243 against 1.253 on average). Because the CONMEBOL qualifiers are our topic, we also compared the two models on only the qualifiers inside the validation folds: the forest is slightly better there too (1.164 against 1.168), although the linear regression is ahead in 2 of the 5 folds. The difference is small, about 0.01 goals, but the rule is clear, so the tuned random forest is our final model. Both models are still evaluated on the test set below, because the project compares the two algorithms.</w:t>
+      </w:r>
+    </w:p>
+    <w:p>
+      <w:pPr>
+        <w:pStyle w:val="Heading2"/>
+      </w:pPr>
+      <w:r>
+        <w:t>6.2 Results on the test set</w:t>
+      </w:r>
+    </w:p>
+    <w:p>
+      <w:r>
+        <w:t>Table 3 shows the results of the two baselines and the two tuned models on the test data, and Figure 3 shows the RMSE, our main metric.</w:t>
+      </w:r>
+    </w:p>
+    <w:p>
+      <w:pPr>
+        <w:pStyle w:val="Caption"/>
+        <w:keepNext/>
+        <w:spacing w:before="120" w:after="80"/>
+      </w:pPr>
+      <w:r>
+        <w:rPr>
+          <w:b/>
+          <w:bCs/>
+        </w:rPr>
+        <w:t xml:space="preserve">Table 3. </w:t>
+      </w:r>
+      <w:r>
+        <w:t xml:space="preserve">Results on the test data. MAE, MSE and RMSE are averaged over home and away goals. W/D/L is the share of correctly predicted results and Exact the share of exactly correct scores. The best value in each column is in bold.</w:t>
       </w:r>
     </w:p>
     <w:tbl>
@@ -4622,752 +4705,7 @@
         <w:pStyle w:val="Heading2"/>
       </w:pPr>
       <w:r>
-        <w:lastRenderedPageBreak/>
-        <w:t>6.1 Tuning and overfitting</w:t>
-      </w:r>
-    </w:p>
-    <w:p>
-      <w:pPr>
-        <w:pStyle w:val="Caption"/>
-        <w:keepNext/>
-        <w:spacing w:before="120" w:after="80"/>
-      </w:pPr>
-      <w:r>
-        <w:rPr>
-          <w:b/>
-          <w:bCs/>
-        </w:rPr>
-        <w:t xml:space="preserve">Table 3. </w:t>
-      </w:r>
-      <w:r>
-        <w:t>RMSE (average of home and away goals) on the whole training data, in the five validation folds (mean) and on the two test sets. The best values in the validation and test columns are in bold (a low training RMSE alone is not a good sign).</w:t>
-      </w:r>
-    </w:p>
-    <w:tbl>
-      <w:tblPr>
-        <w:tblW w:w="9026" w:type="dxa"/>
-        <w:jc w:val="center"/>
-        <w:tblBorders>
-          <w:top w:val="single" w:sz="4" w:space="0" w:color="auto"/>
-          <w:left w:val="single" w:sz="4" w:space="0" w:color="auto"/>
-          <w:bottom w:val="single" w:sz="4" w:space="0" w:color="auto"/>
-          <w:right w:val="single" w:sz="4" w:space="0" w:color="auto"/>
-          <w:insideH w:val="single" w:sz="4" w:space="0" w:color="auto"/>
-          <w:insideV w:val="single" w:sz="4" w:space="0" w:color="auto"/>
-        </w:tblBorders>
-        <w:tblLook w:val="04A0" w:firstRow="1" w:lastRow="0" w:firstColumn="1" w:lastColumn="0" w:noHBand="0" w:noVBand="1"/>
-      </w:tblPr>
-      <w:tblGrid>
-        <w:gridCol w:w="3226"/>
-        <w:gridCol w:w="1450"/>
-        <w:gridCol w:w="1450"/>
-        <w:gridCol w:w="1450"/>
-        <w:gridCol w:w="1450"/>
-      </w:tblGrid>
-      <w:tr>
-        <w:trPr>
-          <w:cantSplit/>
-          <w:tblHeader/>
-          <w:jc w:val="center"/>
-        </w:trPr>
-        <w:tc>
-          <w:tcPr>
-            <w:tcW w:w="3226" w:type="dxa"/>
-            <w:tcBorders>
-              <w:top w:val="single" w:sz="4" w:space="0" w:color="BFBFBF"/>
-              <w:left w:val="none" w:sz="0" w:space="0" w:color="FFFFFF"/>
-              <w:bottom w:val="single" w:sz="4" w:space="0" w:color="BFBFBF"/>
-              <w:right w:val="none" w:sz="0" w:space="0" w:color="FFFFFF"/>
-            </w:tcBorders>
-            <w:shd w:val="clear" w:color="auto" w:fill="EDEFF3"/>
-            <w:tcMar>
-              <w:top w:w="50" w:type="dxa"/>
-              <w:left w:w="100" w:type="dxa"/>
-              <w:bottom w:w="50" w:type="dxa"/>
-              <w:right w:w="100" w:type="dxa"/>
-            </w:tcMar>
-            <w:vAlign w:val="center"/>
-          </w:tcPr>
-          <w:p>
-            <w:pPr>
-              <w:keepNext/>
-              <w:spacing w:after="0" w:line="240" w:lineRule="auto"/>
-            </w:pPr>
-            <w:r>
-              <w:rPr>
-                <w:b/>
-                <w:bCs/>
-                <w:sz w:val="19"/>
-                <w:szCs w:val="19"/>
-              </w:rPr>
-              <w:t>Model</w:t>
-            </w:r>
-          </w:p>
-        </w:tc>
-        <w:tc>
-          <w:tcPr>
-            <w:tcW w:w="1450" w:type="dxa"/>
-            <w:tcBorders>
-              <w:top w:val="single" w:sz="4" w:space="0" w:color="BFBFBF"/>
-              <w:left w:val="none" w:sz="0" w:space="0" w:color="FFFFFF"/>
-              <w:bottom w:val="single" w:sz="4" w:space="0" w:color="BFBFBF"/>
-              <w:right w:val="none" w:sz="0" w:space="0" w:color="FFFFFF"/>
-            </w:tcBorders>
-            <w:shd w:val="clear" w:color="auto" w:fill="EDEFF3"/>
-            <w:tcMar>
-              <w:top w:w="50" w:type="dxa"/>
-              <w:left w:w="100" w:type="dxa"/>
-              <w:bottom w:w="50" w:type="dxa"/>
-              <w:right w:w="100" w:type="dxa"/>
-            </w:tcMar>
-            <w:vAlign w:val="center"/>
-          </w:tcPr>
-          <w:p>
-            <w:pPr>
-              <w:keepNext/>
-              <w:spacing w:after="0" w:line="240" w:lineRule="auto"/>
-              <w:jc w:val="center"/>
-            </w:pPr>
-            <w:r>
-              <w:rPr>
-                <w:b/>
-                <w:bCs/>
-                <w:sz w:val="19"/>
-                <w:szCs w:val="19"/>
-              </w:rPr>
-              <w:t>Training</w:t>
-            </w:r>
-          </w:p>
-        </w:tc>
-        <w:tc>
-          <w:tcPr>
-            <w:tcW w:w="1450" w:type="dxa"/>
-            <w:tcBorders>
-              <w:top w:val="single" w:sz="4" w:space="0" w:color="BFBFBF"/>
-              <w:left w:val="none" w:sz="0" w:space="0" w:color="FFFFFF"/>
-              <w:bottom w:val="single" w:sz="4" w:space="0" w:color="BFBFBF"/>
-              <w:right w:val="none" w:sz="0" w:space="0" w:color="FFFFFF"/>
-            </w:tcBorders>
-            <w:shd w:val="clear" w:color="auto" w:fill="EDEFF3"/>
-            <w:tcMar>
-              <w:top w:w="50" w:type="dxa"/>
-              <w:left w:w="100" w:type="dxa"/>
-              <w:bottom w:w="50" w:type="dxa"/>
-              <w:right w:w="100" w:type="dxa"/>
-            </w:tcMar>
-            <w:vAlign w:val="center"/>
-          </w:tcPr>
-          <w:p>
-            <w:pPr>
-              <w:keepNext/>
-              <w:spacing w:after="0" w:line="240" w:lineRule="auto"/>
-              <w:jc w:val="center"/>
-            </w:pPr>
-            <w:r>
-              <w:rPr>
-                <w:b/>
-                <w:bCs/>
-                <w:sz w:val="19"/>
-                <w:szCs w:val="19"/>
-              </w:rPr>
-              <w:t>Validation</w:t>
-            </w:r>
-          </w:p>
-        </w:tc>
-        <w:tc>
-          <w:tcPr>
-            <w:tcW w:w="1450" w:type="dxa"/>
-            <w:tcBorders>
-              <w:top w:val="single" w:sz="4" w:space="0" w:color="BFBFBF"/>
-              <w:left w:val="none" w:sz="0" w:space="0" w:color="FFFFFF"/>
-              <w:bottom w:val="single" w:sz="4" w:space="0" w:color="BFBFBF"/>
-              <w:right w:val="none" w:sz="0" w:space="0" w:color="FFFFFF"/>
-            </w:tcBorders>
-            <w:shd w:val="clear" w:color="auto" w:fill="EDEFF3"/>
-            <w:tcMar>
-              <w:top w:w="50" w:type="dxa"/>
-              <w:left w:w="100" w:type="dxa"/>
-              <w:bottom w:w="50" w:type="dxa"/>
-              <w:right w:w="100" w:type="dxa"/>
-            </w:tcMar>
-            <w:vAlign w:val="center"/>
-          </w:tcPr>
-          <w:p>
-            <w:pPr>
-              <w:keepNext/>
-              <w:spacing w:after="0" w:line="240" w:lineRule="auto"/>
-              <w:jc w:val="center"/>
-            </w:pPr>
-            <w:r>
-              <w:rPr>
-                <w:b/>
-                <w:bCs/>
-                <w:sz w:val="19"/>
-                <w:szCs w:val="19"/>
-              </w:rPr>
-              <w:t>Test (all)</w:t>
-            </w:r>
-          </w:p>
-        </w:tc>
-        <w:tc>
-          <w:tcPr>
-            <w:tcW w:w="1450" w:type="dxa"/>
-            <w:tcBorders>
-              <w:top w:val="single" w:sz="4" w:space="0" w:color="BFBFBF"/>
-              <w:left w:val="none" w:sz="0" w:space="0" w:color="FFFFFF"/>
-              <w:bottom w:val="single" w:sz="4" w:space="0" w:color="BFBFBF"/>
-              <w:right w:val="none" w:sz="0" w:space="0" w:color="FFFFFF"/>
-            </w:tcBorders>
-            <w:shd w:val="clear" w:color="auto" w:fill="EDEFF3"/>
-            <w:tcMar>
-              <w:top w:w="50" w:type="dxa"/>
-              <w:left w:w="100" w:type="dxa"/>
-              <w:bottom w:w="50" w:type="dxa"/>
-              <w:right w:w="100" w:type="dxa"/>
-            </w:tcMar>
-            <w:vAlign w:val="center"/>
-          </w:tcPr>
-          <w:p>
-            <w:pPr>
-              <w:keepNext/>
-              <w:spacing w:after="0" w:line="240" w:lineRule="auto"/>
-              <w:jc w:val="center"/>
-            </w:pPr>
-            <w:r>
-              <w:rPr>
-                <w:b/>
-                <w:bCs/>
-                <w:sz w:val="19"/>
-                <w:szCs w:val="19"/>
-              </w:rPr>
-              <w:t>Test (CONMEBOL)</w:t>
-            </w:r>
-          </w:p>
-        </w:tc>
-      </w:tr>
-      <w:tr>
-        <w:trPr>
-          <w:cantSplit/>
-          <w:jc w:val="center"/>
-        </w:trPr>
-        <w:tc>
-          <w:tcPr>
-            <w:tcW w:w="3226" w:type="dxa"/>
-            <w:tcBorders>
-              <w:top w:val="single" w:sz="4" w:space="0" w:color="BFBFBF"/>
-              <w:left w:val="none" w:sz="0" w:space="0" w:color="FFFFFF"/>
-              <w:bottom w:val="single" w:sz="4" w:space="0" w:color="BFBFBF"/>
-              <w:right w:val="none" w:sz="0" w:space="0" w:color="FFFFFF"/>
-            </w:tcBorders>
-            <w:tcMar>
-              <w:top w:w="50" w:type="dxa"/>
-              <w:left w:w="100" w:type="dxa"/>
-              <w:bottom w:w="50" w:type="dxa"/>
-              <w:right w:w="100" w:type="dxa"/>
-            </w:tcMar>
-            <w:vAlign w:val="center"/>
-          </w:tcPr>
-          <w:p>
-            <w:pPr>
-              <w:keepNext/>
-              <w:spacing w:after="0" w:line="240" w:lineRule="auto"/>
-            </w:pPr>
-            <w:r>
-              <w:rPr>
-                <w:sz w:val="19"/>
-                <w:szCs w:val="19"/>
-              </w:rPr>
-              <w:t>Linear regression (λ = 0.01)</w:t>
-            </w:r>
-          </w:p>
-        </w:tc>
-        <w:tc>
-          <w:tcPr>
-            <w:tcW w:w="1450" w:type="dxa"/>
-            <w:tcBorders>
-              <w:top w:val="single" w:sz="4" w:space="0" w:color="BFBFBF"/>
-              <w:left w:val="none" w:sz="0" w:space="0" w:color="FFFFFF"/>
-              <w:bottom w:val="single" w:sz="4" w:space="0" w:color="BFBFBF"/>
-              <w:right w:val="none" w:sz="0" w:space="0" w:color="FFFFFF"/>
-            </w:tcBorders>
-            <w:tcMar>
-              <w:top w:w="50" w:type="dxa"/>
-              <w:left w:w="100" w:type="dxa"/>
-              <w:bottom w:w="50" w:type="dxa"/>
-              <w:right w:w="100" w:type="dxa"/>
-            </w:tcMar>
-            <w:vAlign w:val="center"/>
-          </w:tcPr>
-          <w:p>
-            <w:pPr>
-              <w:keepNext/>
-              <w:spacing w:after="0" w:line="240" w:lineRule="auto"/>
-              <w:jc w:val="center"/>
-            </w:pPr>
-            <w:r>
-              <w:rPr>
-                <w:sz w:val="19"/>
-                <w:szCs w:val="19"/>
-              </w:rPr>
-              <w:t>1.266</w:t>
-            </w:r>
-          </w:p>
-        </w:tc>
-        <w:tc>
-          <w:tcPr>
-            <w:tcW w:w="1450" w:type="dxa"/>
-            <w:tcBorders>
-              <w:top w:val="single" w:sz="4" w:space="0" w:color="BFBFBF"/>
-              <w:left w:val="none" w:sz="0" w:space="0" w:color="FFFFFF"/>
-              <w:bottom w:val="single" w:sz="4" w:space="0" w:color="BFBFBF"/>
-              <w:right w:val="none" w:sz="0" w:space="0" w:color="FFFFFF"/>
-            </w:tcBorders>
-            <w:tcMar>
-              <w:top w:w="50" w:type="dxa"/>
-              <w:left w:w="100" w:type="dxa"/>
-              <w:bottom w:w="50" w:type="dxa"/>
-              <w:right w:w="100" w:type="dxa"/>
-            </w:tcMar>
-            <w:vAlign w:val="center"/>
-          </w:tcPr>
-          <w:p>
-            <w:pPr>
-              <w:keepNext/>
-              <w:spacing w:after="0" w:line="240" w:lineRule="auto"/>
-              <w:jc w:val="center"/>
-            </w:pPr>
-            <w:r>
-              <w:rPr>
-                <w:sz w:val="19"/>
-                <w:szCs w:val="19"/>
-              </w:rPr>
-              <w:t>1.253</w:t>
-            </w:r>
-          </w:p>
-        </w:tc>
-        <w:tc>
-          <w:tcPr>
-            <w:tcW w:w="1450" w:type="dxa"/>
-            <w:tcBorders>
-              <w:top w:val="single" w:sz="4" w:space="0" w:color="BFBFBF"/>
-              <w:left w:val="none" w:sz="0" w:space="0" w:color="FFFFFF"/>
-              <w:bottom w:val="single" w:sz="4" w:space="0" w:color="BFBFBF"/>
-              <w:right w:val="none" w:sz="0" w:space="0" w:color="FFFFFF"/>
-            </w:tcBorders>
-            <w:tcMar>
-              <w:top w:w="50" w:type="dxa"/>
-              <w:left w:w="100" w:type="dxa"/>
-              <w:bottom w:w="50" w:type="dxa"/>
-              <w:right w:w="100" w:type="dxa"/>
-            </w:tcMar>
-            <w:vAlign w:val="center"/>
-          </w:tcPr>
-          <w:p>
-            <w:pPr>
-              <w:keepNext/>
-              <w:spacing w:after="0" w:line="240" w:lineRule="auto"/>
-              <w:jc w:val="center"/>
-            </w:pPr>
-            <w:r>
-              <w:rPr>
-                <w:sz w:val="19"/>
-                <w:szCs w:val="19"/>
-              </w:rPr>
-              <w:t>1.227</w:t>
-            </w:r>
-          </w:p>
-        </w:tc>
-        <w:tc>
-          <w:tcPr>
-            <w:tcW w:w="1450" w:type="dxa"/>
-            <w:tcBorders>
-              <w:top w:val="single" w:sz="4" w:space="0" w:color="BFBFBF"/>
-              <w:left w:val="none" w:sz="0" w:space="0" w:color="FFFFFF"/>
-              <w:bottom w:val="single" w:sz="4" w:space="0" w:color="BFBFBF"/>
-              <w:right w:val="none" w:sz="0" w:space="0" w:color="FFFFFF"/>
-            </w:tcBorders>
-            <w:tcMar>
-              <w:top w:w="50" w:type="dxa"/>
-              <w:left w:w="100" w:type="dxa"/>
-              <w:bottom w:w="50" w:type="dxa"/>
-              <w:right w:w="100" w:type="dxa"/>
-            </w:tcMar>
-            <w:vAlign w:val="center"/>
-          </w:tcPr>
-          <w:p>
-            <w:pPr>
-              <w:keepNext/>
-              <w:spacing w:after="0" w:line="240" w:lineRule="auto"/>
-              <w:jc w:val="center"/>
-            </w:pPr>
-            <w:r>
-              <w:rPr>
-                <w:b/>
-                <w:bCs/>
-                <w:sz w:val="19"/>
-                <w:szCs w:val="19"/>
-              </w:rPr>
-              <w:t>1.109</w:t>
-            </w:r>
-          </w:p>
-        </w:tc>
-      </w:tr>
-      <w:tr>
-        <w:trPr>
-          <w:cantSplit/>
-          <w:jc w:val="center"/>
-        </w:trPr>
-        <w:tc>
-          <w:tcPr>
-            <w:tcW w:w="3226" w:type="dxa"/>
-            <w:tcBorders>
-              <w:top w:val="single" w:sz="4" w:space="0" w:color="BFBFBF"/>
-              <w:left w:val="none" w:sz="0" w:space="0" w:color="FFFFFF"/>
-              <w:bottom w:val="single" w:sz="4" w:space="0" w:color="BFBFBF"/>
-              <w:right w:val="none" w:sz="0" w:space="0" w:color="FFFFFF"/>
-            </w:tcBorders>
-            <w:tcMar>
-              <w:top w:w="50" w:type="dxa"/>
-              <w:left w:w="100" w:type="dxa"/>
-              <w:bottom w:w="50" w:type="dxa"/>
-              <w:right w:w="100" w:type="dxa"/>
-            </w:tcMar>
-            <w:vAlign w:val="center"/>
-          </w:tcPr>
-          <w:p>
-            <w:pPr>
-              <w:keepNext/>
-              <w:spacing w:after="0" w:line="240" w:lineRule="auto"/>
-            </w:pPr>
-            <w:r>
-              <w:rPr>
-                <w:sz w:val="19"/>
-                <w:szCs w:val="19"/>
-              </w:rPr>
-              <w:t>Random forest, default settings</w:t>
-            </w:r>
-          </w:p>
-        </w:tc>
-        <w:tc>
-          <w:tcPr>
-            <w:tcW w:w="1450" w:type="dxa"/>
-            <w:tcBorders>
-              <w:top w:val="single" w:sz="4" w:space="0" w:color="BFBFBF"/>
-              <w:left w:val="none" w:sz="0" w:space="0" w:color="FFFFFF"/>
-              <w:bottom w:val="single" w:sz="4" w:space="0" w:color="BFBFBF"/>
-              <w:right w:val="none" w:sz="0" w:space="0" w:color="FFFFFF"/>
-            </w:tcBorders>
-            <w:tcMar>
-              <w:top w:w="50" w:type="dxa"/>
-              <w:left w:w="100" w:type="dxa"/>
-              <w:bottom w:w="50" w:type="dxa"/>
-              <w:right w:w="100" w:type="dxa"/>
-            </w:tcMar>
-            <w:vAlign w:val="center"/>
-          </w:tcPr>
-          <w:p>
-            <w:pPr>
-              <w:keepNext/>
-              <w:spacing w:after="0" w:line="240" w:lineRule="auto"/>
-              <w:jc w:val="center"/>
-            </w:pPr>
-            <w:r>
-              <w:rPr>
-                <w:sz w:val="19"/>
-                <w:szCs w:val="19"/>
-              </w:rPr>
-              <w:t>0.475</w:t>
-            </w:r>
-          </w:p>
-        </w:tc>
-        <w:tc>
-          <w:tcPr>
-            <w:tcW w:w="1450" w:type="dxa"/>
-            <w:tcBorders>
-              <w:top w:val="single" w:sz="4" w:space="0" w:color="BFBFBF"/>
-              <w:left w:val="none" w:sz="0" w:space="0" w:color="FFFFFF"/>
-              <w:bottom w:val="single" w:sz="4" w:space="0" w:color="BFBFBF"/>
-              <w:right w:val="none" w:sz="0" w:space="0" w:color="FFFFFF"/>
-            </w:tcBorders>
-            <w:tcMar>
-              <w:top w:w="50" w:type="dxa"/>
-              <w:left w:w="100" w:type="dxa"/>
-              <w:bottom w:w="50" w:type="dxa"/>
-              <w:right w:w="100" w:type="dxa"/>
-            </w:tcMar>
-            <w:vAlign w:val="center"/>
-          </w:tcPr>
-          <w:p>
-            <w:pPr>
-              <w:keepNext/>
-              <w:spacing w:after="0" w:line="240" w:lineRule="auto"/>
-              <w:jc w:val="center"/>
-            </w:pPr>
-            <w:r>
-              <w:rPr>
-                <w:sz w:val="19"/>
-                <w:szCs w:val="19"/>
-              </w:rPr>
-              <w:t>1.275</w:t>
-            </w:r>
-          </w:p>
-        </w:tc>
-        <w:tc>
-          <w:tcPr>
-            <w:tcW w:w="1450" w:type="dxa"/>
-            <w:tcBorders>
-              <w:top w:val="single" w:sz="4" w:space="0" w:color="BFBFBF"/>
-              <w:left w:val="none" w:sz="0" w:space="0" w:color="FFFFFF"/>
-              <w:bottom w:val="single" w:sz="4" w:space="0" w:color="BFBFBF"/>
-              <w:right w:val="none" w:sz="0" w:space="0" w:color="FFFFFF"/>
-            </w:tcBorders>
-            <w:tcMar>
-              <w:top w:w="50" w:type="dxa"/>
-              <w:left w:w="100" w:type="dxa"/>
-              <w:bottom w:w="50" w:type="dxa"/>
-              <w:right w:w="100" w:type="dxa"/>
-            </w:tcMar>
-            <w:vAlign w:val="center"/>
-          </w:tcPr>
-          <w:p>
-            <w:pPr>
-              <w:keepNext/>
-              <w:spacing w:after="0" w:line="240" w:lineRule="auto"/>
-              <w:jc w:val="center"/>
-            </w:pPr>
-            <w:r>
-              <w:rPr>
-                <w:sz w:val="19"/>
-                <w:szCs w:val="19"/>
-              </w:rPr>
-              <w:t>1.248</w:t>
-            </w:r>
-          </w:p>
-        </w:tc>
-        <w:tc>
-          <w:tcPr>
-            <w:tcW w:w="1450" w:type="dxa"/>
-            <w:tcBorders>
-              <w:top w:val="single" w:sz="4" w:space="0" w:color="BFBFBF"/>
-              <w:left w:val="none" w:sz="0" w:space="0" w:color="FFFFFF"/>
-              <w:bottom w:val="single" w:sz="4" w:space="0" w:color="BFBFBF"/>
-              <w:right w:val="none" w:sz="0" w:space="0" w:color="FFFFFF"/>
-            </w:tcBorders>
-            <w:tcMar>
-              <w:top w:w="50" w:type="dxa"/>
-              <w:left w:w="100" w:type="dxa"/>
-              <w:bottom w:w="50" w:type="dxa"/>
-              <w:right w:w="100" w:type="dxa"/>
-            </w:tcMar>
-            <w:vAlign w:val="center"/>
-          </w:tcPr>
-          <w:p>
-            <w:pPr>
-              <w:keepNext/>
-              <w:spacing w:after="0" w:line="240" w:lineRule="auto"/>
-              <w:jc w:val="center"/>
-            </w:pPr>
-            <w:r>
-              <w:rPr>
-                <w:sz w:val="19"/>
-                <w:szCs w:val="19"/>
-              </w:rPr>
-              <w:t>1.181</w:t>
-            </w:r>
-          </w:p>
-        </w:tc>
-      </w:tr>
-      <w:tr>
-        <w:trPr>
-          <w:cantSplit/>
-          <w:jc w:val="center"/>
-        </w:trPr>
-        <w:tc>
-          <w:tcPr>
-            <w:tcW w:w="3226" w:type="dxa"/>
-            <w:tcBorders>
-              <w:top w:val="single" w:sz="4" w:space="0" w:color="BFBFBF"/>
-              <w:left w:val="none" w:sz="0" w:space="0" w:color="FFFFFF"/>
-              <w:bottom w:val="single" w:sz="4" w:space="0" w:color="BFBFBF"/>
-              <w:right w:val="none" w:sz="0" w:space="0" w:color="FFFFFF"/>
-            </w:tcBorders>
-            <w:tcMar>
-              <w:top w:w="50" w:type="dxa"/>
-              <w:left w:w="100" w:type="dxa"/>
-              <w:bottom w:w="50" w:type="dxa"/>
-              <w:right w:w="100" w:type="dxa"/>
-            </w:tcMar>
-            <w:vAlign w:val="center"/>
-          </w:tcPr>
-          <w:p>
-            <w:pPr>
-              <w:keepNext/>
-              <w:spacing w:after="0" w:line="240" w:lineRule="auto"/>
-            </w:pPr>
-            <w:r>
-              <w:rPr>
-                <w:sz w:val="19"/>
-                <w:szCs w:val="19"/>
-              </w:rPr>
-              <w:t>Random forest, tuned</w:t>
-            </w:r>
-          </w:p>
-        </w:tc>
-        <w:tc>
-          <w:tcPr>
-            <w:tcW w:w="1450" w:type="dxa"/>
-            <w:tcBorders>
-              <w:top w:val="single" w:sz="4" w:space="0" w:color="BFBFBF"/>
-              <w:left w:val="none" w:sz="0" w:space="0" w:color="FFFFFF"/>
-              <w:bottom w:val="single" w:sz="4" w:space="0" w:color="BFBFBF"/>
-              <w:right w:val="none" w:sz="0" w:space="0" w:color="FFFFFF"/>
-            </w:tcBorders>
-            <w:tcMar>
-              <w:top w:w="50" w:type="dxa"/>
-              <w:left w:w="100" w:type="dxa"/>
-              <w:bottom w:w="50" w:type="dxa"/>
-              <w:right w:w="100" w:type="dxa"/>
-            </w:tcMar>
-            <w:vAlign w:val="center"/>
-          </w:tcPr>
-          <w:p>
-            <w:pPr>
-              <w:keepNext/>
-              <w:spacing w:after="0" w:line="240" w:lineRule="auto"/>
-              <w:jc w:val="center"/>
-            </w:pPr>
-            <w:r>
-              <w:rPr>
-                <w:sz w:val="19"/>
-                <w:szCs w:val="19"/>
-              </w:rPr>
-              <w:t>1.153</w:t>
-            </w:r>
-          </w:p>
-        </w:tc>
-        <w:tc>
-          <w:tcPr>
-            <w:tcW w:w="1450" w:type="dxa"/>
-            <w:tcBorders>
-              <w:top w:val="single" w:sz="4" w:space="0" w:color="BFBFBF"/>
-              <w:left w:val="none" w:sz="0" w:space="0" w:color="FFFFFF"/>
-              <w:bottom w:val="single" w:sz="4" w:space="0" w:color="BFBFBF"/>
-              <w:right w:val="none" w:sz="0" w:space="0" w:color="FFFFFF"/>
-            </w:tcBorders>
-            <w:tcMar>
-              <w:top w:w="50" w:type="dxa"/>
-              <w:left w:w="100" w:type="dxa"/>
-              <w:bottom w:w="50" w:type="dxa"/>
-              <w:right w:w="100" w:type="dxa"/>
-            </w:tcMar>
-            <w:vAlign w:val="center"/>
-          </w:tcPr>
-          <w:p>
-            <w:pPr>
-              <w:keepNext/>
-              <w:spacing w:after="0" w:line="240" w:lineRule="auto"/>
-              <w:jc w:val="center"/>
-            </w:pPr>
-            <w:r>
-              <w:rPr>
-                <w:b/>
-                <w:bCs/>
-                <w:sz w:val="19"/>
-                <w:szCs w:val="19"/>
-              </w:rPr>
-              <w:t>1.243</w:t>
-            </w:r>
-          </w:p>
-        </w:tc>
-        <w:tc>
-          <w:tcPr>
-            <w:tcW w:w="1450" w:type="dxa"/>
-            <w:tcBorders>
-              <w:top w:val="single" w:sz="4" w:space="0" w:color="BFBFBF"/>
-              <w:left w:val="none" w:sz="0" w:space="0" w:color="FFFFFF"/>
-              <w:bottom w:val="single" w:sz="4" w:space="0" w:color="BFBFBF"/>
-              <w:right w:val="none" w:sz="0" w:space="0" w:color="FFFFFF"/>
-            </w:tcBorders>
-            <w:tcMar>
-              <w:top w:w="50" w:type="dxa"/>
-              <w:left w:w="100" w:type="dxa"/>
-              <w:bottom w:w="50" w:type="dxa"/>
-              <w:right w:w="100" w:type="dxa"/>
-            </w:tcMar>
-            <w:vAlign w:val="center"/>
-          </w:tcPr>
-          <w:p>
-            <w:pPr>
-              <w:keepNext/>
-              <w:spacing w:after="0" w:line="240" w:lineRule="auto"/>
-              <w:jc w:val="center"/>
-            </w:pPr>
-            <w:r>
-              <w:rPr>
-                <w:b/>
-                <w:bCs/>
-                <w:sz w:val="19"/>
-                <w:szCs w:val="19"/>
-              </w:rPr>
-              <w:t>1.225</w:t>
-            </w:r>
-          </w:p>
-        </w:tc>
-        <w:tc>
-          <w:tcPr>
-            <w:tcW w:w="1450" w:type="dxa"/>
-            <w:tcBorders>
-              <w:top w:val="single" w:sz="4" w:space="0" w:color="BFBFBF"/>
-              <w:left w:val="none" w:sz="0" w:space="0" w:color="FFFFFF"/>
-              <w:bottom w:val="single" w:sz="4" w:space="0" w:color="BFBFBF"/>
-              <w:right w:val="none" w:sz="0" w:space="0" w:color="FFFFFF"/>
-            </w:tcBorders>
-            <w:tcMar>
-              <w:top w:w="50" w:type="dxa"/>
-              <w:left w:w="100" w:type="dxa"/>
-              <w:bottom w:w="50" w:type="dxa"/>
-              <w:right w:w="100" w:type="dxa"/>
-            </w:tcMar>
-            <w:vAlign w:val="center"/>
-          </w:tcPr>
-          <w:p>
-            <w:pPr>
-              <w:keepNext/>
-              <w:spacing w:after="0" w:line="240" w:lineRule="auto"/>
-              <w:jc w:val="center"/>
-            </w:pPr>
-            <w:r>
-              <w:rPr>
-                <w:sz w:val="19"/>
-                <w:szCs w:val="19"/>
-              </w:rPr>
-              <w:t>1.139</w:t>
-            </w:r>
-          </w:p>
-        </w:tc>
-      </w:tr>
-    </w:tbl>
-    <w:p>
-      <w:pPr>
-        <w:spacing w:after="60"/>
-      </w:pPr>
-    </w:p>
-    <w:p>
-      <w:r>
-        <w:t>Table 3 shows that the linear regression does not overfit: the training, validation and test errors are very close, and they only differ because they are measured on different matches. Regularisation therefore hardly matters. The best λ was 0.01, only 0.0002 better than no penalty, and every λ from 0.1 and up was worse in all five folds. With 25,266 matches and 17 features there is simply not much to overfit.</w:t>
-      </w:r>
-    </w:p>
-    <w:p>
-      <w:r>
-        <w:t>The random forest with default settings overfits a lot. Its trees grow until the leaves are pure (11,682 leaves per tree on average), so it almost learns the training matches by heart (training RMSE 0.475) but does worse on new matches (1.275 in validation). The grid search chose 500 trees, a maximum depth of 10, at least 5 matches per leaf and half of the features at each split. These trees have only 399 leaves on average, and the validation RMSE improved from 1.275 to 1.243, better than the linear regression (1.253), although the forest still overfits a little. On the test data the tuning improved the RMSE from 1.248 to 1.225 on all matches and from 1.181 to 1.139 on the qualifiers. The worst combinations in the grid had fully grown trees (one match per leaf and no or a high depth limit), while the best ones were very close: 21 of the 54 combinations were within 0.005 of the best.</w:t>
-      </w:r>
-    </w:p>
-    <w:p>
-      <w:pPr>
-        <w:pStyle w:val="Heading2"/>
-      </w:pPr>
-      <w:r>
-        <w:t>6.2 What the models learned</w:t>
+        <w:t>6.3 What the models learned</w:t>
       </w:r>
     </w:p>
     <w:p>
@@ -5442,7 +4780,6 @@
     </w:p>
     <w:p>
       <w:r>
-        <w:lastRenderedPageBreak/>
         <w:t>The coefficients of the linear model can also be read directly. In the original units, 100 extra Elo points for the home team mean 0.23 more home goals and 0.15 fewer away goals, a neutral venue means 0.19 fewer goals for the home team and 0.29 more for the away team, and every kilometre of altitude gives the home team 0.06 more goals and the away team 0.10 fewer. Many features are correlated (a team with a high rating usually also has good form), so single coefficients should be read with care.</w:t>
       </w:r>
     </w:p>
@@ -5451,7 +4788,7 @@
         <w:pStyle w:val="Heading2"/>
       </w:pPr>
       <w:r>
-        <w:t>6.3 The CONMEBOL qualifiers</w:t>
+        <w:t>6.4 The CONMEBOL qualifiers</w:t>
       </w:r>
     </w:p>
     <w:p>
@@ -5531,15 +4868,7 @@
     </w:p>
     <w:p>
       <w:r>
-        <w:t xml:space="preserve">Bolivia is the clearest example. It played six home matches in El Alto, at about 4,100 metres, a venue that was never used in the training period. The linear regression predicted a higher score for the opponent in four of the six, for example 0.4–1.7 against Brazil, but Bolivia won four of them, including 1–0 against Brazil, and drew the other two. Already in the training data, the model predicted Bolivia to score 1.20 goals per home qualifier, while </w:t>
-      </w:r>
-      <w:proofErr w:type="gramStart"/>
-      <w:r>
-        <w:t>in reality they</w:t>
-      </w:r>
-      <w:proofErr w:type="gramEnd"/>
-      <w:r>
-        <w:t xml:space="preserve"> scored 1.66.</w:t>
+        <w:t xml:space="preserve">Bolivia is the clearest example. It played six home matches in El Alto, at about 4,100 metres, a venue that was never used in the training period. The linear regression predicted a higher score for the opponent in four of the six, for example 0.4–1.7 against Brazil, but Bolivia won four of them, including 1–0 against Brazil, and drew the other two. Already in the training data, the model predicted Bolivia to score 1.20 goals per home qualifier, while in reality they scored 1.66.</w:t>
       </w:r>
     </w:p>
     <w:p>
@@ -5565,7 +4894,6 @@
     </w:p>
     <w:p>
       <w:r>
-        <w:lastRenderedPageBreak/>
         <w:t>On the 90 CONMEBOL qualifiers the linear regression is better by 0.030 goals and was better in 93% of the resamples, but the interval (−0.067 to +0.010) still includes 0, so with only 90 matches we cannot be sure. Here even the improvement over the venue baseline is not certain, for either model. The bootstrap also treats the matches as independent, which they are not quite, since the same teams play many times, so the real uncertainty is probably somewhat larger.</w:t>
       </w:r>
     </w:p>
@@ -5576,7 +4904,7 @@
     </w:p>
     <w:p>
       <w:r>
-        <w:t>We choose the linear regression as our final model. It is as good as the forest on all matches and probably a little better on the CONMEBOL qualifiers, which is our topic. It is also much simpler: it is fitted in a fraction of a second instead of after 20 minutes of grid search, it does not overfit, and its coefficients can be explained. Its negative predictions are easy to handle by setting them to 0. We should point out that we made this choice after seeing the test results. Everything that was tuned (λ, the forest’s hyperparameters and the draw band) was chosen on the training data only, and no test number changed after that, but the test set is not an independent check of the choice. The next qualifying cycle would be.</w:t>
+        <w:t xml:space="preserve">Our final model is the tuned random forest, chosen with cross-validation in section 6.1 before the test set was used. The test results agree with that choice: on all matches the two models are tied (1.225 against 1.227), and the linear regression's lead on the 90 qualifiers is within the bootstrap noise, so the test set gives no reason to doubt it. Everything else that was tuned (λ, the forest's hyperparameters and the draw band) was also chosen on the training data only, and no test number changed afterwards. The linear regression is still a strong and transparent alternative: it is almost as accurate, it is fitted in a fraction of a second instead of after 20 minutes of grid search, it does not overfit, and its coefficients can be explained. Its weakness is that its straight line can predict negative goals in big mismatches.</w:t>
       </w:r>
     </w:p>
     <w:p>
@@ -5584,42 +4912,12 @@
         <w:pStyle w:val="Heading2"/>
       </w:pPr>
       <w:r>
-        <w:t>7.2 Why the random forest is not better</w:t>
-      </w:r>
-    </w:p>
-    <w:p>
-      <w:r>
-        <w:t xml:space="preserve">We expected the random forest to win, because it can learn non-linear effects. We think there are two reasons why it </w:t>
-      </w:r>
-      <w:proofErr w:type="gramStart"/>
-      <w:r>
-        <w:t>not developed</w:t>
-      </w:r>
-      <w:proofErr w:type="gramEnd"/>
-      <w:r>
-        <w:t xml:space="preserve"> better</w:t>
-      </w:r>
-      <w:r>
-        <w:t xml:space="preserve">. First, most of the useful information is already summarised in one number per team, the Elo rating, and the expected goals seem to change </w:t>
-      </w:r>
-      <w:proofErr w:type="gramStart"/>
-      <w:r>
-        <w:t>fairly smoot</w:t>
-      </w:r>
-      <w:r>
-        <w:t>h</w:t>
-      </w:r>
-      <w:proofErr w:type="gramEnd"/>
-      <w:r>
-        <w:t xml:space="preserve"> with it, so there is not much left for the forest to find. Second, a forest predicts the average of groups of similar training matches, which pulls its predictions towards the overall mean. That makes it careful and stable (Figure 5), but it gives up the </w:t>
-      </w:r>
-      <w:proofErr w:type="gramStart"/>
-      <w:r>
-        <w:t>large predicted</w:t>
-      </w:r>
-      <w:proofErr w:type="gramEnd"/>
-      <w:r>
-        <w:t xml:space="preserve"> differences that the qualifiers, with their strong home advantage, would need.</w:t>
+        <w:t>7.2 Why the two models are so close</w:t>
+      </w:r>
+    </w:p>
+    <w:p>
+      <w:r>
+        <w:t xml:space="preserve">We expected the random forest to win clearly, because it can learn non-linear effects, but it is only slightly better in cross-validation and tied on the test set. We think there are two reasons. First, most of the useful information is already summarised in one number per team, the Elo rating, and the expected goals seem to change fairly smoothly with it, so there is not much left for the forest to find. Second, a forest predicts the average of groups of similar training matches, which pulls its predictions towards the overall mean. That makes it careful and stable (Figure 5), but it gives up the large predicted differences that the qualifiers, with their strong home advantage, would need.</w:t>
       </w:r>
     </w:p>
     <w:p>
@@ -5700,7 +4998,6 @@
           <w:b/>
           <w:bCs/>
         </w:rPr>
-        <w:lastRenderedPageBreak/>
         <w:t>No draws and a small test set.</w:t>
       </w:r>
       <w:r>
@@ -5736,7 +5033,7 @@
     </w:p>
     <w:p>
       <w:r>
-        <w:t>In this project we predicted the home and away goals of CONMEBOL World Cup qualifiers from information known before the match. Since the dataset only contains results, a large part of the work was to build pre-match features without leakage: Elo ratings, recent form, earlier meetings, the venue and its altitude. We implemented linear regression from scratch with both the normal equation and gradient descent, checked that the two agree, and compared it with a tuned random forest using a chronological split. Both models clearly beat the baselines on all 2,269 test matches (RMSE about 1.23 against 1.43) and are practically equally good. On the 90 CONMEBOL qualifiers the linear regression was the best model (RMSE 1.109, against 1.139 for the forest and 1.196 for the best baseline), although the difference is not certain with so few matches. We chose the linear regression because it is just as accurate, simpler, faster and easier to explain. The biggest weakness of both models is the strong home advantage in South America: they predicted too many away goals and did not see Bolivia’s results in El Alto coming.</w:t>
+        <w:t xml:space="preserve">In this project we predicted the home and away goals of CONMEBOL World Cup qualifiers from information known before the match. Since the dataset only contains results, a large part of the work was to build pre-match features without leakage: Elo ratings, recent form, earlier meetings, the venue and its altitude. We implemented linear regression from scratch with both the normal equation and gradient descent, checked that the two agree, and compared it with a tuned random forest using a chronological split. Cross-validation on the training period selected the tuned random forest as our final model, because it had the lower validation error in all five folds. On the test set both models clearly beat the baselines on all 2,269 matches (RMSE about 1.23 against 1.43) and are practically equally good. On the 90 CONMEBOL qualifiers the linear regression was slightly better (RMSE 1.109, against 1.139 for the forest and 1.196 for the best baseline), but that difference is within the noise of so few matches. The linear regression remains a simpler, faster and more transparent alternative. The biggest weakness of both models is the strong home advantage in South America: they predicted too many away goals and did not see Bolivia's results in El Alto coming.</w:t>
       </w:r>
     </w:p>
     <w:p>
@@ -5756,13 +5053,8 @@
       <w:pPr>
         <w:ind w:left="360" w:hanging="360"/>
       </w:pPr>
-      <w:proofErr w:type="spellStart"/>
-      <w:r>
-        <w:t>Breiman</w:t>
-      </w:r>
-      <w:proofErr w:type="spellEnd"/>
-      <w:r>
-        <w:t xml:space="preserve">, L. (2001). Random forests. </w:t>
+      <w:r>
+        <w:t xml:space="preserve">Breiman, L. (2001). Random forests. </w:t>
       </w:r>
       <w:r>
         <w:rPr>
@@ -5797,39 +5089,54 @@
       <w:pPr>
         <w:ind w:left="360" w:hanging="360"/>
       </w:pPr>
-      <w:proofErr w:type="spellStart"/>
-      <w:r>
-        <w:t>Géron</w:t>
-      </w:r>
-      <w:proofErr w:type="spellEnd"/>
-      <w:r>
-        <w:t xml:space="preserve">, A. (2019). </w:t>
+      <w:r>
+        <w:t xml:space="preserve">Géron, A. (2019). </w:t>
       </w:r>
       <w:r>
         <w:rPr>
           <w:i/>
           <w:iCs/>
         </w:rPr>
-        <w:t xml:space="preserve">Hands-On Machine Learning with Scikit-Learn, </w:t>
-      </w:r>
-      <w:proofErr w:type="spellStart"/>
+        <w:t xml:space="preserve">Hands-On Machine Learning with Scikit-Learn, Keras, and TensorFlow</w:t>
+      </w:r>
+      <w:r>
+        <w:t xml:space="preserve"> (2nd ed.). O’Reilly Media.</w:t>
+      </w:r>
+    </w:p>
+    <w:p>
+      <w:pPr>
+        <w:ind w:left="360" w:hanging="360"/>
+      </w:pPr>
+      <w:r>
+        <w:t xml:space="preserve">Jürisoo, M. (2026). </w:t>
+      </w:r>
       <w:r>
         <w:rPr>
           <w:i/>
           <w:iCs/>
         </w:rPr>
-        <w:t>Keras</w:t>
-      </w:r>
-      <w:proofErr w:type="spellEnd"/>
+        <w:t>International football results from 1872</w:t>
+      </w:r>
+      <w:r>
+        <w:t xml:space="preserve"> [Data set]. Kaggle. https://www.kaggle.com/datasets/martj42/international-football-results-from-1872-to-2017</w:t>
+      </w:r>
+    </w:p>
+    <w:p>
+      <w:pPr>
+        <w:ind w:left="360" w:hanging="360"/>
+      </w:pPr>
+      <w:r>
+        <w:t xml:space="preserve">Maher, M. J. (1982). Modelling association football scores. </w:t>
+      </w:r>
       <w:r>
         <w:rPr>
           <w:i/>
           <w:iCs/>
         </w:rPr>
-        <w:t>, and TensorFlow</w:t>
-      </w:r>
-      <w:r>
-        <w:t xml:space="preserve"> (2nd ed.). O’Reilly Media.</w:t>
+        <w:t xml:space="preserve">Statistica Neerlandica, 36</w:t>
+      </w:r>
+      <w:r>
+        <w:t>(3), 109–118.</w:t>
       </w:r>
     </w:p>
     <w:p>
@@ -5837,75 +5144,7 @@
         <w:ind w:left="360" w:hanging="360"/>
       </w:pPr>
       <w:r>
-        <w:t xml:space="preserve">Jürisoo, M. (2026). </w:t>
-      </w:r>
-      <w:r>
-        <w:rPr>
-          <w:i/>
-          <w:iCs/>
-        </w:rPr>
-        <w:t>International football results from 1872</w:t>
-      </w:r>
-      <w:r>
-        <w:t xml:space="preserve"> [Data set]. Kaggle. https://www.kaggle.com/datasets/martj42/international-football-results-from-1872-to-2017</w:t>
-      </w:r>
-    </w:p>
-    <w:p>
-      <w:pPr>
-        <w:ind w:left="360" w:hanging="360"/>
-      </w:pPr>
-      <w:r>
-        <w:t xml:space="preserve">Maher, M. J. (1982). Modelling association football scores. </w:t>
-      </w:r>
-      <w:r>
-        <w:rPr>
-          <w:i/>
-          <w:iCs/>
-        </w:rPr>
-        <w:t xml:space="preserve">Statistica </w:t>
-      </w:r>
-      <w:proofErr w:type="spellStart"/>
-      <w:r>
-        <w:rPr>
-          <w:i/>
-          <w:iCs/>
-        </w:rPr>
-        <w:t>Neerlandica</w:t>
-      </w:r>
-      <w:proofErr w:type="spellEnd"/>
-      <w:r>
-        <w:rPr>
-          <w:i/>
-          <w:iCs/>
-        </w:rPr>
-        <w:t>, 36</w:t>
-      </w:r>
-      <w:r>
-        <w:t>(3), 109–118.</w:t>
-      </w:r>
-    </w:p>
-    <w:p>
-      <w:pPr>
-        <w:ind w:left="360" w:hanging="360"/>
-      </w:pPr>
-      <w:r>
-        <w:t xml:space="preserve">Pedregosa, F., </w:t>
-      </w:r>
-      <w:proofErr w:type="spellStart"/>
-      <w:r>
-        <w:t>Varoquaux</w:t>
-      </w:r>
-      <w:proofErr w:type="spellEnd"/>
-      <w:r>
-        <w:t xml:space="preserve">, G., </w:t>
-      </w:r>
-      <w:proofErr w:type="spellStart"/>
-      <w:r>
-        <w:t>Gramfort</w:t>
-      </w:r>
-      <w:proofErr w:type="spellEnd"/>
-      <w:r>
-        <w:t xml:space="preserve">, A., Michel, V., Thirion, B., Grisel, O., et al. (2011). Scikit-learn: Machine learning in Python. </w:t>
+        <w:t xml:space="preserve">Pedregosa, F., Varoquaux, G., Gramfort, A., Michel, V., Thirion, B., Grisel, O., et al. (2011). Scikit-learn: Machine learning in Python. </w:t>
       </w:r>
       <w:r>
         <w:rPr>

</xml_diff>